<commit_message>
feat: update documentation to reflect version 2.0.0 changes, including new features and API integration details
</commit_message>
<xml_diff>
--- a/documents/Ficha_Tecnica_ETL_Turismo_Loja.docx
+++ b/documents/Ficha_Tecnica_ETL_Turismo_Loja.docx
@@ -50,7 +50,39 @@
           <w:sz w:val="24"/>
           <w:szCs w:val="24"/>
         </w:rPr>
-        <w:t>Versión. 1.0.0</w:t>
+        <w:t xml:space="preserve">Versión. </w:t>
+      </w:r>
+      <w:r>
+        <w:rPr>
+          <w:color w:val="808080"/>
+          <w:sz w:val="24"/>
+          <w:szCs w:val="24"/>
+        </w:rPr>
+        <w:t>2</w:t>
+      </w:r>
+      <w:r>
+        <w:rPr>
+          <w:color w:val="808080"/>
+          <w:sz w:val="24"/>
+          <w:szCs w:val="24"/>
+        </w:rPr>
+        <w:t>.</w:t>
+      </w:r>
+      <w:r>
+        <w:rPr>
+          <w:color w:val="808080"/>
+          <w:sz w:val="24"/>
+          <w:szCs w:val="24"/>
+        </w:rPr>
+        <w:t>0</w:t>
+      </w:r>
+      <w:r>
+        <w:rPr>
+          <w:color w:val="808080"/>
+          <w:sz w:val="24"/>
+          <w:szCs w:val="24"/>
+        </w:rPr>
+        <w:t>.0</w:t>
       </w:r>
     </w:p>
     <w:p>
@@ -104,12 +136,6 @@
         <w:gridCol w:w="6726"/>
       </w:tblGrid>
       <w:tr>
-        <w:tblPrEx>
-          <w:tblCellMar>
-            <w:top w:w="0" w:type="dxa"/>
-            <w:bottom w:w="0" w:type="dxa"/>
-          </w:tblCellMar>
-        </w:tblPrEx>
         <w:tc>
           <w:tcPr>
             <w:tcW w:w="2300" w:type="dxa"/>
@@ -160,12 +186,6 @@
         </w:tc>
       </w:tr>
       <w:tr>
-        <w:tblPrEx>
-          <w:tblCellMar>
-            <w:top w:w="0" w:type="dxa"/>
-            <w:bottom w:w="0" w:type="dxa"/>
-          </w:tblCellMar>
-        </w:tblPrEx>
         <w:tc>
           <w:tcPr>
             <w:tcW w:w="2300" w:type="dxa"/>
@@ -226,15 +246,7 @@
           <w:bCs/>
           <w:color w:val="002060"/>
         </w:rPr>
-        <w:t>Docente Tutor:</w:t>
-      </w:r>
-      <w:r>
-        <w:rPr>
-          <w:b/>
-          <w:bCs/>
-          <w:color w:val="002060"/>
-        </w:rPr>
-        <w:t xml:space="preserve"> </w:t>
+        <w:t xml:space="preserve">Docente Tutor: </w:t>
       </w:r>
       <w:r>
         <w:rPr>
@@ -278,12 +290,6 @@
         <w:gridCol w:w="6707"/>
       </w:tblGrid>
       <w:tr>
-        <w:tblPrEx>
-          <w:tblCellMar>
-            <w:top w:w="0" w:type="dxa"/>
-            <w:bottom w:w="0" w:type="dxa"/>
-          </w:tblCellMar>
-        </w:tblPrEx>
         <w:tc>
           <w:tcPr>
             <w:tcW w:w="2266" w:type="dxa"/>
@@ -340,12 +346,6 @@
         </w:tc>
       </w:tr>
       <w:tr>
-        <w:tblPrEx>
-          <w:tblCellMar>
-            <w:top w:w="0" w:type="dxa"/>
-            <w:bottom w:w="0" w:type="dxa"/>
-          </w:tblCellMar>
-        </w:tblPrEx>
         <w:tc>
           <w:tcPr>
             <w:tcW w:w="2266" w:type="dxa"/>
@@ -396,18 +396,24 @@
               <w:rPr>
                 <w:color w:val="000000"/>
               </w:rPr>
-              <w:t>UTPL — Universidad Técnica Particular de Loja</w:t>
+              <w:t xml:space="preserve">UTPL </w:t>
+            </w:r>
+            <w:r>
+              <w:rPr>
+                <w:color w:val="000000"/>
+              </w:rPr>
+              <w:t>-</w:t>
+            </w:r>
+            <w:r>
+              <w:rPr>
+                <w:color w:val="000000"/>
+              </w:rPr>
+              <w:t xml:space="preserve"> Universidad Técnica Particular de Loja</w:t>
             </w:r>
           </w:p>
         </w:tc>
       </w:tr>
       <w:tr>
-        <w:tblPrEx>
-          <w:tblCellMar>
-            <w:top w:w="0" w:type="dxa"/>
-            <w:bottom w:w="0" w:type="dxa"/>
-          </w:tblCellMar>
-        </w:tblPrEx>
         <w:tc>
           <w:tcPr>
             <w:tcW w:w="2266" w:type="dxa"/>
@@ -461,12 +467,6 @@
         </w:tc>
       </w:tr>
       <w:tr>
-        <w:tblPrEx>
-          <w:tblCellMar>
-            <w:top w:w="0" w:type="dxa"/>
-            <w:bottom w:w="0" w:type="dxa"/>
-          </w:tblCellMar>
-        </w:tblPrEx>
         <w:tc>
           <w:tcPr>
             <w:tcW w:w="2266" w:type="dxa"/>
@@ -517,23 +517,7 @@
               <w:spacing w:before="40" w:after="80"/>
             </w:pPr>
             <w:r>
-              <w:t xml:space="preserve">Sistema web para centralizar, limpiar y gestionar datos de eventos y lugares turísticos de la provincia de Loja (Ecuador). Extrae información de múltiples fuentes digitales (TikTok, YouTube, Instagram, Flickr, TripAdvisor, </w:t>
-            </w:r>
-            <w:proofErr w:type="spellStart"/>
-            <w:r>
-              <w:t>Eventbrite</w:t>
-            </w:r>
-            <w:proofErr w:type="spellEnd"/>
-            <w:r>
-              <w:t xml:space="preserve"> y Google </w:t>
-            </w:r>
-            <w:proofErr w:type="spellStart"/>
-            <w:r>
-              <w:t>Reviews</w:t>
-            </w:r>
-            <w:proofErr w:type="spellEnd"/>
-            <w:r>
-              <w:t>), aplica un pipeline ETL automático y los almacena en MongoDB Atlas.</w:t>
+              <w:t>Sistema web para centralizar, limpiar y gestionar datos de eventos y lugares turísticos de la provincia de Loja (Ecuador). Extrae información real desde YouTube (YouTube Data API v3), aplica un pipeline ETL automático con detección y creación automática de relaciones, y lo almacena en un cluster de MongoDB Atlas compartido por todo el equipo.</w:t>
             </w:r>
           </w:p>
           <w:p>
@@ -547,12 +531,6 @@
         </w:tc>
       </w:tr>
       <w:tr>
-        <w:tblPrEx>
-          <w:tblCellMar>
-            <w:top w:w="0" w:type="dxa"/>
-            <w:bottom w:w="0" w:type="dxa"/>
-          </w:tblCellMar>
-        </w:tblPrEx>
         <w:tc>
           <w:tcPr>
             <w:tcW w:w="2266" w:type="dxa"/>
@@ -618,21 +596,7 @@
               <w:rPr>
                 <w:color w:val="000000"/>
               </w:rPr>
-              <w:t xml:space="preserve">Motor ETL con 7 fuentes de datos configuradas (5 </w:t>
-            </w:r>
-            <w:proofErr w:type="spellStart"/>
-            <w:r>
-              <w:rPr>
-                <w:color w:val="000000"/>
-              </w:rPr>
-              <w:t>mocks</w:t>
-            </w:r>
-            <w:proofErr w:type="spellEnd"/>
-            <w:r>
-              <w:rPr>
-                <w:color w:val="000000"/>
-              </w:rPr>
-              <w:t xml:space="preserve"> + 2 listas para conectar API real)</w:t>
+              <w:t>Motor ETL con YouTube Data API v3 activa como fuente real (sin datos simulados); 6 fuentes adicionales evaluadas y documentadas para activación futura según presupuesto/aprobación</w:t>
             </w:r>
           </w:p>
           <w:p>
@@ -647,21 +611,7 @@
               <w:rPr>
                 <w:color w:val="000000"/>
               </w:rPr>
-              <w:t xml:space="preserve">Pipeline automático de transformación, </w:t>
-            </w:r>
-            <w:proofErr w:type="spellStart"/>
-            <w:r>
-              <w:rPr>
-                <w:color w:val="000000"/>
-              </w:rPr>
-              <w:t>deduplicación</w:t>
-            </w:r>
-            <w:proofErr w:type="spellEnd"/>
-            <w:r>
-              <w:rPr>
-                <w:color w:val="000000"/>
-              </w:rPr>
-              <w:t xml:space="preserve"> y detección de lugares</w:t>
+              <w:t>Pipeline automático de transformación, deduplicación, detección de lugares y creación automática de ediciones por año (con estado calculado por calendario: Planificada, En curso o Finalizada)</w:t>
             </w:r>
           </w:p>
           <w:p>
@@ -691,7 +641,7 @@
               <w:rPr>
                 <w:color w:val="000000"/>
               </w:rPr>
-              <w:t>CRUD completo de Recursos, Lugares, Eventos y Ediciones</w:t>
+              <w:t>CRUD completo de Recursos, Lugares, Eventos y Ediciones, con buscador en vivo y detección de nombres duplicados o parecidos (typos, variantes de redacción) antes de guardar</w:t>
             </w:r>
           </w:p>
           <w:p>
@@ -706,7 +656,7 @@
               <w:rPr>
                 <w:color w:val="000000"/>
               </w:rPr>
-              <w:t>Detección automática de lugares nuevos con modal de confirmación</w:t>
+              <w:t>Detección automática de lugares nuevos con modal de confirmación (disponible en el pipeline; se activa con fuentes que reporten ubicación, como Flickr, aún no activa)</w:t>
             </w:r>
           </w:p>
           <w:p>
@@ -721,7 +671,8 @@
               <w:rPr>
                 <w:color w:val="000000"/>
               </w:rPr>
-              <w:t>Detección automática de edición por año de publicación y palabras clave del evento</w:t>
+              <w:lastRenderedPageBreak/>
+              <w:t>Detección automática de edición por año de publicación y palabras clave del evento — si la edición detectada no existe todavía, el sistema la crea solo</w:t>
             </w:r>
           </w:p>
           <w:p>
@@ -732,33 +683,11 @@
                 <w:numId w:val="2"/>
               </w:numPr>
             </w:pPr>
-            <w:proofErr w:type="spellStart"/>
-            <w:r>
-              <w:rPr>
-                <w:color w:val="000000"/>
-              </w:rPr>
-              <w:t>Dashboard</w:t>
-            </w:r>
-            <w:proofErr w:type="spellEnd"/>
-            <w:r>
-              <w:rPr>
-                <w:color w:val="000000"/>
-              </w:rPr>
-              <w:t xml:space="preserve"> Home con </w:t>
-            </w:r>
-            <w:proofErr w:type="spellStart"/>
-            <w:r>
-              <w:rPr>
-                <w:color w:val="000000"/>
-              </w:rPr>
-              <w:t>KPIs</w:t>
-            </w:r>
-            <w:proofErr w:type="spellEnd"/>
-            <w:r>
-              <w:rPr>
-                <w:color w:val="000000"/>
-              </w:rPr>
-              <w:t xml:space="preserve"> reales e indicadores EDA (en desarrollo)</w:t>
+            <w:r>
+              <w:rPr>
+                <w:color w:val="000000"/>
+              </w:rPr>
+              <w:t>Editor de recursos con selector en cascada Evento → Edición y reflejo visual de los valores ya asignados</w:t>
             </w:r>
           </w:p>
           <w:p>
@@ -773,71 +702,9 @@
               <w:rPr>
                 <w:color w:val="000000"/>
               </w:rPr>
-              <w:t xml:space="preserve">Arquitectura de conectores escalable para agregar nuevas fuentes sin modificar el </w:t>
-            </w:r>
-            <w:proofErr w:type="spellStart"/>
-            <w:r>
-              <w:rPr>
-                <w:color w:val="000000"/>
-              </w:rPr>
-              <w:t>core</w:t>
-            </w:r>
-            <w:proofErr w:type="spellEnd"/>
-          </w:p>
-        </w:tc>
-      </w:tr>
-      <w:tr>
-        <w:tblPrEx>
-          <w:tblCellMar>
-            <w:top w:w="0" w:type="dxa"/>
-            <w:bottom w:w="0" w:type="dxa"/>
-          </w:tblCellMar>
-        </w:tblPrEx>
-        <w:tc>
-          <w:tcPr>
-            <w:tcW w:w="2266" w:type="dxa"/>
-            <w:tcBorders>
-              <w:top w:val="single" w:sz="1" w:space="0" w:color="AAAAAA"/>
-              <w:left w:val="single" w:sz="1" w:space="0" w:color="AAAAAA"/>
-              <w:bottom w:val="single" w:sz="1" w:space="0" w:color="AAAAAA"/>
-              <w:right w:val="single" w:sz="1" w:space="0" w:color="AAAAAA"/>
-            </w:tcBorders>
-            <w:shd w:val="clear" w:color="auto" w:fill="E8F4FC"/>
-            <w:tcMar>
-              <w:top w:w="80" w:type="dxa"/>
-              <w:left w:w="120" w:type="dxa"/>
-              <w:bottom w:w="80" w:type="dxa"/>
-              <w:right w:w="120" w:type="dxa"/>
-            </w:tcMar>
-          </w:tcPr>
-          <w:p>
-            <w:r>
-              <w:rPr>
-                <w:b/>
-                <w:bCs/>
-                <w:color w:val="000000"/>
-              </w:rPr>
-              <w:t>Limitaciones conocidas</w:t>
-            </w:r>
-          </w:p>
-        </w:tc>
-        <w:tc>
-          <w:tcPr>
-            <w:tcW w:w="6554" w:type="dxa"/>
-            <w:tcBorders>
-              <w:top w:val="single" w:sz="1" w:space="0" w:color="AAAAAA"/>
-              <w:left w:val="single" w:sz="1" w:space="0" w:color="AAAAAA"/>
-              <w:bottom w:val="single" w:sz="1" w:space="0" w:color="AAAAAA"/>
-              <w:right w:val="single" w:sz="1" w:space="0" w:color="AAAAAA"/>
-            </w:tcBorders>
-            <w:shd w:val="clear" w:color="auto" w:fill="E8F4FC"/>
-            <w:tcMar>
-              <w:top w:w="80" w:type="dxa"/>
-              <w:left w:w="120" w:type="dxa"/>
-              <w:bottom w:w="80" w:type="dxa"/>
-              <w:right w:w="120" w:type="dxa"/>
-            </w:tcMar>
-          </w:tcPr>
+              <w:t>Dashboard Home con KPIs reales, distribución por plataforma y estado, línea de tiempo de ingesta mensual y ranking de eventos (top lugares pendiente)</w:t>
+            </w:r>
+          </w:p>
           <w:p>
             <w:pPr>
               <w:pStyle w:val="Prrafodelista"/>
@@ -850,58 +717,58 @@
               <w:rPr>
                 <w:color w:val="000000"/>
               </w:rPr>
-              <w:t xml:space="preserve">Las 7 fuentes ETL operan actualmente en modo </w:t>
-            </w:r>
-            <w:proofErr w:type="spellStart"/>
-            <w:r>
-              <w:rPr>
-                <w:color w:val="000000"/>
-              </w:rPr>
-              <w:t>mock</w:t>
-            </w:r>
-            <w:proofErr w:type="spellEnd"/>
-            <w:r>
-              <w:rPr>
-                <w:color w:val="000000"/>
-              </w:rPr>
-              <w:t xml:space="preserve"> (datos simulados). Las </w:t>
-            </w:r>
-            <w:proofErr w:type="spellStart"/>
-            <w:r>
-              <w:rPr>
-                <w:color w:val="000000"/>
-              </w:rPr>
-              <w:t>APIs</w:t>
-            </w:r>
-            <w:proofErr w:type="spellEnd"/>
-            <w:r>
-              <w:rPr>
-                <w:color w:val="000000"/>
-              </w:rPr>
-              <w:t xml:space="preserve"> reales de TikTok, YouTube, Instagram, </w:t>
-            </w:r>
-            <w:r>
-              <w:rPr>
+              <w:t>Arquitectura de conectores escalable para agregar nuevas fuentes sin modificar el core</w:t>
+            </w:r>
+          </w:p>
+        </w:tc>
+      </w:tr>
+      <w:tr>
+        <w:tc>
+          <w:tcPr>
+            <w:tcW w:w="2266" w:type="dxa"/>
+            <w:tcBorders>
+              <w:top w:val="single" w:sz="1" w:space="0" w:color="AAAAAA"/>
+              <w:left w:val="single" w:sz="1" w:space="0" w:color="AAAAAA"/>
+              <w:bottom w:val="single" w:sz="1" w:space="0" w:color="AAAAAA"/>
+              <w:right w:val="single" w:sz="1" w:space="0" w:color="AAAAAA"/>
+            </w:tcBorders>
+            <w:shd w:val="clear" w:color="auto" w:fill="E8F4FC"/>
+            <w:tcMar>
+              <w:top w:w="80" w:type="dxa"/>
+              <w:left w:w="120" w:type="dxa"/>
+              <w:bottom w:w="80" w:type="dxa"/>
+              <w:right w:w="120" w:type="dxa"/>
+            </w:tcMar>
+          </w:tcPr>
+          <w:p>
+            <w:r>
+              <w:rPr>
+                <w:b/>
+                <w:bCs/>
                 <w:color w:val="000000"/>
               </w:rPr>
               <w:lastRenderedPageBreak/>
-              <w:t xml:space="preserve">Flickr, TripAdvisor, </w:t>
-            </w:r>
-            <w:proofErr w:type="spellStart"/>
-            <w:r>
-              <w:rPr>
-                <w:color w:val="000000"/>
-              </w:rPr>
-              <w:t>Eventbrite</w:t>
-            </w:r>
-            <w:proofErr w:type="spellEnd"/>
-            <w:r>
-              <w:rPr>
-                <w:color w:val="000000"/>
-              </w:rPr>
-              <w:t xml:space="preserve"> y Google Places están documentadas pero requieren credenciales para activarse.</w:t>
-            </w:r>
-          </w:p>
+              <w:t>Limitaciones conocidas</w:t>
+            </w:r>
+          </w:p>
+        </w:tc>
+        <w:tc>
+          <w:tcPr>
+            <w:tcW w:w="6554" w:type="dxa"/>
+            <w:tcBorders>
+              <w:top w:val="single" w:sz="1" w:space="0" w:color="AAAAAA"/>
+              <w:left w:val="single" w:sz="1" w:space="0" w:color="AAAAAA"/>
+              <w:bottom w:val="single" w:sz="1" w:space="0" w:color="AAAAAA"/>
+              <w:right w:val="single" w:sz="1" w:space="0" w:color="AAAAAA"/>
+            </w:tcBorders>
+            <w:shd w:val="clear" w:color="auto" w:fill="E8F4FC"/>
+            <w:tcMar>
+              <w:top w:w="80" w:type="dxa"/>
+              <w:left w:w="120" w:type="dxa"/>
+              <w:bottom w:w="80" w:type="dxa"/>
+              <w:right w:w="120" w:type="dxa"/>
+            </w:tcMar>
+          </w:tcPr>
           <w:p>
             <w:pPr>
               <w:pStyle w:val="Prrafodelista"/>
@@ -914,49 +781,7 @@
               <w:rPr>
                 <w:color w:val="000000"/>
               </w:rPr>
-              <w:t xml:space="preserve">El módulo EDA del Home está parcialmente implementado. Los </w:t>
-            </w:r>
-            <w:proofErr w:type="spellStart"/>
-            <w:r>
-              <w:rPr>
-                <w:color w:val="000000"/>
-              </w:rPr>
-              <w:t>KPIs</w:t>
-            </w:r>
-            <w:proofErr w:type="spellEnd"/>
-            <w:r>
-              <w:rPr>
-                <w:color w:val="000000"/>
-              </w:rPr>
-              <w:t xml:space="preserve"> de distribución por plataforma, estado e ingesta mensual esperan </w:t>
-            </w:r>
-            <w:proofErr w:type="spellStart"/>
-            <w:r>
-              <w:rPr>
-                <w:color w:val="000000"/>
-              </w:rPr>
-              <w:t>endpoints</w:t>
-            </w:r>
-            <w:proofErr w:type="spellEnd"/>
-            <w:r>
-              <w:rPr>
-                <w:color w:val="000000"/>
-              </w:rPr>
-              <w:t xml:space="preserve"> /api/</w:t>
-            </w:r>
-            <w:proofErr w:type="spellStart"/>
-            <w:r>
-              <w:rPr>
-                <w:color w:val="000000"/>
-              </w:rPr>
-              <w:t>stats</w:t>
-            </w:r>
-            <w:proofErr w:type="spellEnd"/>
-            <w:r>
-              <w:rPr>
-                <w:color w:val="000000"/>
-              </w:rPr>
-              <w:t xml:space="preserve"> dedicados.</w:t>
+              <w:t>De las 7 fuentes evaluadas, solo YouTube Data API v3 está activa (100% real, sin mocks). Las otras seis (TikTok, Instagram, Flickr, TripAdvisor, Eventbrite y Google Places) quedaron descartadas por ahora, no por falta de desarrollo sino porque requieren inversión económica o procesos de aprobación largos e inciertos (detalle completo en guia_implementacion_apis.md).</w:t>
             </w:r>
           </w:p>
           <w:p>
@@ -971,7 +796,7 @@
               <w:rPr>
                 <w:color w:val="000000"/>
               </w:rPr>
-              <w:t>No existe autenticación de usuarios. El sistema asume uso en entorno interno o de desarrollo.</w:t>
+              <w:t>El módulo EDA del Home ya está implementado en su mayoría (distribución por plataforma/estado, ingesta mensual, ranking de eventos, todo con datos reales vía /api/stats). Falta únicamente el indicador de “top lugares” (detalle en guia_implementacion_eda.md).</w:t>
             </w:r>
           </w:p>
           <w:p>
@@ -986,906 +811,9 @@
               <w:rPr>
                 <w:color w:val="000000"/>
               </w:rPr>
-              <w:t xml:space="preserve">El </w:t>
-            </w:r>
-            <w:proofErr w:type="spellStart"/>
-            <w:r>
-              <w:rPr>
-                <w:color w:val="000000"/>
-              </w:rPr>
-              <w:t>frontend</w:t>
-            </w:r>
-            <w:proofErr w:type="spellEnd"/>
-            <w:r>
-              <w:rPr>
-                <w:color w:val="000000"/>
-              </w:rPr>
-              <w:t xml:space="preserve"> no tiene </w:t>
-            </w:r>
-            <w:proofErr w:type="spellStart"/>
-            <w:r>
-              <w:rPr>
-                <w:color w:val="000000"/>
-              </w:rPr>
-              <w:t>build</w:t>
-            </w:r>
-            <w:proofErr w:type="spellEnd"/>
-            <w:r>
-              <w:rPr>
-                <w:color w:val="000000"/>
-              </w:rPr>
-              <w:t xml:space="preserve"> </w:t>
-            </w:r>
-            <w:proofErr w:type="spellStart"/>
-            <w:r>
-              <w:rPr>
-                <w:color w:val="000000"/>
-              </w:rPr>
-              <w:t>tools</w:t>
-            </w:r>
-            <w:proofErr w:type="spellEnd"/>
-            <w:r>
-              <w:rPr>
-                <w:color w:val="000000"/>
-              </w:rPr>
-              <w:t xml:space="preserve"> ni optimización de producción. Requiere Live Server o servidor estático para funcionar correctamente.</w:t>
-            </w:r>
-          </w:p>
-        </w:tc>
-      </w:tr>
-      <w:tr>
-        <w:tblPrEx>
-          <w:tblCellMar>
-            <w:top w:w="0" w:type="dxa"/>
-            <w:bottom w:w="0" w:type="dxa"/>
-          </w:tblCellMar>
-        </w:tblPrEx>
-        <w:tc>
-          <w:tcPr>
-            <w:tcW w:w="2266" w:type="dxa"/>
-            <w:tcBorders>
-              <w:top w:val="single" w:sz="1" w:space="0" w:color="AAAAAA"/>
-              <w:left w:val="single" w:sz="1" w:space="0" w:color="AAAAAA"/>
-              <w:bottom w:val="single" w:sz="1" w:space="0" w:color="AAAAAA"/>
-              <w:right w:val="single" w:sz="1" w:space="0" w:color="AAAAAA"/>
-            </w:tcBorders>
-            <w:shd w:val="clear" w:color="auto" w:fill="FFFFFF"/>
-            <w:tcMar>
-              <w:top w:w="80" w:type="dxa"/>
-              <w:left w:w="120" w:type="dxa"/>
-              <w:bottom w:w="80" w:type="dxa"/>
-              <w:right w:w="120" w:type="dxa"/>
-            </w:tcMar>
-          </w:tcPr>
-          <w:p>
-            <w:r>
-              <w:rPr>
-                <w:b/>
-                <w:bCs/>
-                <w:color w:val="000000"/>
-              </w:rPr>
-              <w:lastRenderedPageBreak/>
-              <w:t>Fecha de creación</w:t>
-            </w:r>
-          </w:p>
-        </w:tc>
-        <w:tc>
-          <w:tcPr>
-            <w:tcW w:w="6554" w:type="dxa"/>
-            <w:tcBorders>
-              <w:top w:val="single" w:sz="1" w:space="0" w:color="AAAAAA"/>
-              <w:left w:val="single" w:sz="1" w:space="0" w:color="AAAAAA"/>
-              <w:bottom w:val="single" w:sz="1" w:space="0" w:color="AAAAAA"/>
-              <w:right w:val="single" w:sz="1" w:space="0" w:color="AAAAAA"/>
-            </w:tcBorders>
-            <w:shd w:val="clear" w:color="auto" w:fill="FFFFFF"/>
-            <w:tcMar>
-              <w:top w:w="80" w:type="dxa"/>
-              <w:left w:w="120" w:type="dxa"/>
-              <w:bottom w:w="80" w:type="dxa"/>
-              <w:right w:w="120" w:type="dxa"/>
-            </w:tcMar>
-          </w:tcPr>
-          <w:p>
-            <w:r>
-              <w:rPr>
-                <w:color w:val="000000"/>
-              </w:rPr>
-              <w:t>Junio 2026</w:t>
-            </w:r>
-          </w:p>
-        </w:tc>
-      </w:tr>
-      <w:tr>
-        <w:tblPrEx>
-          <w:tblCellMar>
-            <w:top w:w="0" w:type="dxa"/>
-            <w:bottom w:w="0" w:type="dxa"/>
-          </w:tblCellMar>
-        </w:tblPrEx>
-        <w:tc>
-          <w:tcPr>
-            <w:tcW w:w="2266" w:type="dxa"/>
-            <w:tcBorders>
-              <w:top w:val="single" w:sz="1" w:space="0" w:color="AAAAAA"/>
-              <w:left w:val="single" w:sz="1" w:space="0" w:color="AAAAAA"/>
-              <w:bottom w:val="single" w:sz="1" w:space="0" w:color="AAAAAA"/>
-              <w:right w:val="single" w:sz="1" w:space="0" w:color="AAAAAA"/>
-            </w:tcBorders>
-            <w:shd w:val="clear" w:color="auto" w:fill="E8F4FC"/>
-            <w:tcMar>
-              <w:top w:w="80" w:type="dxa"/>
-              <w:left w:w="120" w:type="dxa"/>
-              <w:bottom w:w="80" w:type="dxa"/>
-              <w:right w:w="120" w:type="dxa"/>
-            </w:tcMar>
-          </w:tcPr>
-          <w:p>
-            <w:r>
-              <w:rPr>
-                <w:b/>
-                <w:bCs/>
-                <w:color w:val="000000"/>
-              </w:rPr>
-              <w:t>Fecha de última actualización</w:t>
-            </w:r>
-          </w:p>
-        </w:tc>
-        <w:tc>
-          <w:tcPr>
-            <w:tcW w:w="6554" w:type="dxa"/>
-            <w:tcBorders>
-              <w:top w:val="single" w:sz="1" w:space="0" w:color="AAAAAA"/>
-              <w:left w:val="single" w:sz="1" w:space="0" w:color="AAAAAA"/>
-              <w:bottom w:val="single" w:sz="1" w:space="0" w:color="AAAAAA"/>
-              <w:right w:val="single" w:sz="1" w:space="0" w:color="AAAAAA"/>
-            </w:tcBorders>
-            <w:shd w:val="clear" w:color="auto" w:fill="E8F4FC"/>
-            <w:tcMar>
-              <w:top w:w="80" w:type="dxa"/>
-              <w:left w:w="120" w:type="dxa"/>
-              <w:bottom w:w="80" w:type="dxa"/>
-              <w:right w:w="120" w:type="dxa"/>
-            </w:tcMar>
-          </w:tcPr>
-          <w:p>
-            <w:r>
-              <w:rPr>
-                <w:color w:val="000000"/>
-              </w:rPr>
-              <w:t>Junio 2026</w:t>
-            </w:r>
-          </w:p>
-        </w:tc>
-      </w:tr>
-      <w:tr>
-        <w:tblPrEx>
-          <w:tblCellMar>
-            <w:top w:w="0" w:type="dxa"/>
-            <w:bottom w:w="0" w:type="dxa"/>
-          </w:tblCellMar>
-        </w:tblPrEx>
-        <w:tc>
-          <w:tcPr>
-            <w:tcW w:w="2266" w:type="dxa"/>
-            <w:tcBorders>
-              <w:top w:val="single" w:sz="1" w:space="0" w:color="AAAAAA"/>
-              <w:left w:val="single" w:sz="1" w:space="0" w:color="AAAAAA"/>
-              <w:bottom w:val="single" w:sz="1" w:space="0" w:color="AAAAAA"/>
-              <w:right w:val="single" w:sz="1" w:space="0" w:color="AAAAAA"/>
-            </w:tcBorders>
-            <w:shd w:val="clear" w:color="auto" w:fill="FFFFFF"/>
-            <w:tcMar>
-              <w:top w:w="80" w:type="dxa"/>
-              <w:left w:w="120" w:type="dxa"/>
-              <w:bottom w:w="80" w:type="dxa"/>
-              <w:right w:w="120" w:type="dxa"/>
-            </w:tcMar>
-          </w:tcPr>
-          <w:p>
-            <w:r>
-              <w:rPr>
-                <w:b/>
-                <w:bCs/>
-                <w:color w:val="000000"/>
-              </w:rPr>
-              <w:t>Última versión</w:t>
-            </w:r>
-          </w:p>
-        </w:tc>
-        <w:tc>
-          <w:tcPr>
-            <w:tcW w:w="6554" w:type="dxa"/>
-            <w:tcBorders>
-              <w:top w:val="single" w:sz="1" w:space="0" w:color="AAAAAA"/>
-              <w:left w:val="single" w:sz="1" w:space="0" w:color="AAAAAA"/>
-              <w:bottom w:val="single" w:sz="1" w:space="0" w:color="AAAAAA"/>
-              <w:right w:val="single" w:sz="1" w:space="0" w:color="AAAAAA"/>
-            </w:tcBorders>
-            <w:shd w:val="clear" w:color="auto" w:fill="FFFFFF"/>
-            <w:tcMar>
-              <w:top w:w="80" w:type="dxa"/>
-              <w:left w:w="120" w:type="dxa"/>
-              <w:bottom w:w="80" w:type="dxa"/>
-              <w:right w:w="120" w:type="dxa"/>
-            </w:tcMar>
-          </w:tcPr>
-          <w:p>
-            <w:r>
-              <w:rPr>
-                <w:color w:val="000000"/>
-              </w:rPr>
-              <w:t>1.0.0</w:t>
-            </w:r>
-          </w:p>
-        </w:tc>
-      </w:tr>
-      <w:tr>
-        <w:tblPrEx>
-          <w:tblCellMar>
-            <w:top w:w="0" w:type="dxa"/>
-            <w:bottom w:w="0" w:type="dxa"/>
-          </w:tblCellMar>
-        </w:tblPrEx>
-        <w:tc>
-          <w:tcPr>
-            <w:tcW w:w="2266" w:type="dxa"/>
-            <w:tcBorders>
-              <w:top w:val="single" w:sz="1" w:space="0" w:color="AAAAAA"/>
-              <w:left w:val="single" w:sz="1" w:space="0" w:color="AAAAAA"/>
-              <w:bottom w:val="single" w:sz="1" w:space="0" w:color="AAAAAA"/>
-              <w:right w:val="single" w:sz="1" w:space="0" w:color="AAAAAA"/>
-            </w:tcBorders>
-            <w:shd w:val="clear" w:color="auto" w:fill="E8F4FC"/>
-            <w:tcMar>
-              <w:top w:w="80" w:type="dxa"/>
-              <w:left w:w="120" w:type="dxa"/>
-              <w:bottom w:w="80" w:type="dxa"/>
-              <w:right w:w="120" w:type="dxa"/>
-            </w:tcMar>
-          </w:tcPr>
-          <w:p>
-            <w:r>
-              <w:rPr>
-                <w:b/>
-                <w:bCs/>
-                <w:color w:val="000000"/>
-              </w:rPr>
-              <w:t>Última versión de prueba</w:t>
-            </w:r>
-          </w:p>
-        </w:tc>
-        <w:tc>
-          <w:tcPr>
-            <w:tcW w:w="6554" w:type="dxa"/>
-            <w:tcBorders>
-              <w:top w:val="single" w:sz="1" w:space="0" w:color="AAAAAA"/>
-              <w:left w:val="single" w:sz="1" w:space="0" w:color="AAAAAA"/>
-              <w:bottom w:val="single" w:sz="1" w:space="0" w:color="AAAAAA"/>
-              <w:right w:val="single" w:sz="1" w:space="0" w:color="AAAAAA"/>
-            </w:tcBorders>
-            <w:shd w:val="clear" w:color="auto" w:fill="E8F4FC"/>
-            <w:tcMar>
-              <w:top w:w="80" w:type="dxa"/>
-              <w:left w:w="120" w:type="dxa"/>
-              <w:bottom w:w="80" w:type="dxa"/>
-              <w:right w:w="120" w:type="dxa"/>
-            </w:tcMar>
-          </w:tcPr>
-          <w:p>
-            <w:r>
-              <w:rPr>
-                <w:color w:val="000000"/>
-              </w:rPr>
-              <w:t>1.0.0</w:t>
-            </w:r>
-          </w:p>
-        </w:tc>
-      </w:tr>
-      <w:tr>
-        <w:tblPrEx>
-          <w:tblCellMar>
-            <w:top w:w="0" w:type="dxa"/>
-            <w:bottom w:w="0" w:type="dxa"/>
-          </w:tblCellMar>
-        </w:tblPrEx>
-        <w:tc>
-          <w:tcPr>
-            <w:tcW w:w="2266" w:type="dxa"/>
-            <w:tcBorders>
-              <w:top w:val="single" w:sz="1" w:space="0" w:color="AAAAAA"/>
-              <w:left w:val="single" w:sz="1" w:space="0" w:color="AAAAAA"/>
-              <w:bottom w:val="single" w:sz="1" w:space="0" w:color="AAAAAA"/>
-              <w:right w:val="single" w:sz="1" w:space="0" w:color="AAAAAA"/>
-            </w:tcBorders>
-            <w:shd w:val="clear" w:color="auto" w:fill="FFFFFF"/>
-            <w:tcMar>
-              <w:top w:w="80" w:type="dxa"/>
-              <w:left w:w="120" w:type="dxa"/>
-              <w:bottom w:w="80" w:type="dxa"/>
-              <w:right w:w="120" w:type="dxa"/>
-            </w:tcMar>
-          </w:tcPr>
-          <w:p>
-            <w:r>
-              <w:rPr>
-                <w:b/>
-                <w:bCs/>
-                <w:color w:val="000000"/>
-              </w:rPr>
-              <w:t>Género</w:t>
-            </w:r>
-          </w:p>
-        </w:tc>
-        <w:tc>
-          <w:tcPr>
-            <w:tcW w:w="6554" w:type="dxa"/>
-            <w:tcBorders>
-              <w:top w:val="single" w:sz="1" w:space="0" w:color="AAAAAA"/>
-              <w:left w:val="single" w:sz="1" w:space="0" w:color="AAAAAA"/>
-              <w:bottom w:val="single" w:sz="1" w:space="0" w:color="AAAAAA"/>
-              <w:right w:val="single" w:sz="1" w:space="0" w:color="AAAAAA"/>
-            </w:tcBorders>
-            <w:shd w:val="clear" w:color="auto" w:fill="FFFFFF"/>
-            <w:tcMar>
-              <w:top w:w="80" w:type="dxa"/>
-              <w:left w:w="120" w:type="dxa"/>
-              <w:bottom w:w="80" w:type="dxa"/>
-              <w:right w:w="120" w:type="dxa"/>
-            </w:tcMar>
-          </w:tcPr>
-          <w:p>
-            <w:r>
-              <w:rPr>
-                <w:color w:val="000000"/>
-              </w:rPr>
-              <w:t>Aplicación web — Gestión de datos / ETL / Turismo</w:t>
-            </w:r>
-          </w:p>
-        </w:tc>
-      </w:tr>
-      <w:tr>
-        <w:tblPrEx>
-          <w:tblCellMar>
-            <w:top w:w="0" w:type="dxa"/>
-            <w:bottom w:w="0" w:type="dxa"/>
-          </w:tblCellMar>
-        </w:tblPrEx>
-        <w:tc>
-          <w:tcPr>
-            <w:tcW w:w="2266" w:type="dxa"/>
-            <w:tcBorders>
-              <w:top w:val="single" w:sz="1" w:space="0" w:color="AAAAAA"/>
-              <w:left w:val="single" w:sz="1" w:space="0" w:color="AAAAAA"/>
-              <w:bottom w:val="single" w:sz="1" w:space="0" w:color="AAAAAA"/>
-              <w:right w:val="single" w:sz="1" w:space="0" w:color="AAAAAA"/>
-            </w:tcBorders>
-            <w:shd w:val="clear" w:color="auto" w:fill="E8F4FC"/>
-            <w:tcMar>
-              <w:top w:w="80" w:type="dxa"/>
-              <w:left w:w="120" w:type="dxa"/>
-              <w:bottom w:w="80" w:type="dxa"/>
-              <w:right w:w="120" w:type="dxa"/>
-            </w:tcMar>
-          </w:tcPr>
-          <w:p>
-            <w:r>
-              <w:rPr>
-                <w:b/>
-                <w:bCs/>
-                <w:color w:val="000000"/>
-              </w:rPr>
-              <w:t>Lenguaje de programación</w:t>
-            </w:r>
-          </w:p>
-        </w:tc>
-        <w:tc>
-          <w:tcPr>
-            <w:tcW w:w="6554" w:type="dxa"/>
-            <w:tcBorders>
-              <w:top w:val="single" w:sz="1" w:space="0" w:color="AAAAAA"/>
-              <w:left w:val="single" w:sz="1" w:space="0" w:color="AAAAAA"/>
-              <w:bottom w:val="single" w:sz="1" w:space="0" w:color="AAAAAA"/>
-              <w:right w:val="single" w:sz="1" w:space="0" w:color="AAAAAA"/>
-            </w:tcBorders>
-            <w:shd w:val="clear" w:color="auto" w:fill="E8F4FC"/>
-            <w:tcMar>
-              <w:top w:w="80" w:type="dxa"/>
-              <w:left w:w="120" w:type="dxa"/>
-              <w:bottom w:w="80" w:type="dxa"/>
-              <w:right w:w="120" w:type="dxa"/>
-            </w:tcMar>
-          </w:tcPr>
-          <w:p>
-            <w:pPr>
-              <w:rPr>
-                <w:lang w:val="en-US"/>
-              </w:rPr>
-            </w:pPr>
-            <w:r>
-              <w:rPr>
-                <w:color w:val="000000"/>
-                <w:lang w:val="en-US"/>
-              </w:rPr>
-              <w:t>Python 3.11 (</w:t>
-            </w:r>
-            <w:proofErr w:type="gramStart"/>
-            <w:r>
-              <w:rPr>
-                <w:color w:val="000000"/>
-                <w:lang w:val="en-US"/>
-              </w:rPr>
-              <w:t>backend) ·</w:t>
-            </w:r>
-            <w:proofErr w:type="gramEnd"/>
-            <w:r>
-              <w:rPr>
-                <w:color w:val="000000"/>
-                <w:lang w:val="en-US"/>
-              </w:rPr>
-              <w:t xml:space="preserve"> JavaScript ES2022 (frontend)</w:t>
-            </w:r>
-          </w:p>
-        </w:tc>
-      </w:tr>
-      <w:tr>
-        <w:tblPrEx>
-          <w:tblCellMar>
-            <w:top w:w="0" w:type="dxa"/>
-            <w:bottom w:w="0" w:type="dxa"/>
-          </w:tblCellMar>
-        </w:tblPrEx>
-        <w:tc>
-          <w:tcPr>
-            <w:tcW w:w="2266" w:type="dxa"/>
-            <w:tcBorders>
-              <w:top w:val="single" w:sz="1" w:space="0" w:color="AAAAAA"/>
-              <w:left w:val="single" w:sz="1" w:space="0" w:color="AAAAAA"/>
-              <w:bottom w:val="single" w:sz="1" w:space="0" w:color="AAAAAA"/>
-              <w:right w:val="single" w:sz="1" w:space="0" w:color="AAAAAA"/>
-            </w:tcBorders>
-            <w:shd w:val="clear" w:color="auto" w:fill="FFFFFF"/>
-            <w:tcMar>
-              <w:top w:w="80" w:type="dxa"/>
-              <w:left w:w="120" w:type="dxa"/>
-              <w:bottom w:w="80" w:type="dxa"/>
-              <w:right w:w="120" w:type="dxa"/>
-            </w:tcMar>
-          </w:tcPr>
-          <w:p>
-            <w:proofErr w:type="spellStart"/>
-            <w:r>
-              <w:rPr>
-                <w:b/>
-                <w:bCs/>
-                <w:color w:val="000000"/>
-              </w:rPr>
-              <w:t>Frameworks</w:t>
-            </w:r>
-            <w:proofErr w:type="spellEnd"/>
-            <w:r>
-              <w:rPr>
-                <w:b/>
-                <w:bCs/>
-                <w:color w:val="000000"/>
-              </w:rPr>
-              <w:t xml:space="preserve"> y librerías</w:t>
-            </w:r>
-          </w:p>
-        </w:tc>
-        <w:tc>
-          <w:tcPr>
-            <w:tcW w:w="6554" w:type="dxa"/>
-            <w:tcBorders>
-              <w:top w:val="single" w:sz="1" w:space="0" w:color="AAAAAA"/>
-              <w:left w:val="single" w:sz="1" w:space="0" w:color="AAAAAA"/>
-              <w:bottom w:val="single" w:sz="1" w:space="0" w:color="AAAAAA"/>
-              <w:right w:val="single" w:sz="1" w:space="0" w:color="AAAAAA"/>
-            </w:tcBorders>
-            <w:shd w:val="clear" w:color="auto" w:fill="FFFFFF"/>
-            <w:tcMar>
-              <w:top w:w="80" w:type="dxa"/>
-              <w:left w:w="120" w:type="dxa"/>
-              <w:bottom w:w="80" w:type="dxa"/>
-              <w:right w:w="120" w:type="dxa"/>
-            </w:tcMar>
-          </w:tcPr>
-          <w:p>
-            <w:pPr>
-              <w:rPr>
-                <w:lang w:val="en-US"/>
-              </w:rPr>
-            </w:pPr>
-            <w:proofErr w:type="spellStart"/>
-            <w:r>
-              <w:rPr>
-                <w:color w:val="000000"/>
-                <w:lang w:val="en-US"/>
-              </w:rPr>
-              <w:t>FastAPI</w:t>
-            </w:r>
-            <w:proofErr w:type="spellEnd"/>
-            <w:r>
-              <w:rPr>
-                <w:color w:val="000000"/>
-                <w:lang w:val="en-US"/>
-              </w:rPr>
-              <w:t xml:space="preserve"> · </w:t>
-            </w:r>
-            <w:proofErr w:type="spellStart"/>
-            <w:r>
-              <w:rPr>
-                <w:color w:val="000000"/>
-                <w:lang w:val="en-US"/>
-              </w:rPr>
-              <w:t>Uvicorn</w:t>
-            </w:r>
-            <w:proofErr w:type="spellEnd"/>
-            <w:r>
-              <w:rPr>
-                <w:color w:val="000000"/>
-                <w:lang w:val="en-US"/>
-              </w:rPr>
-              <w:t xml:space="preserve"> · </w:t>
-            </w:r>
-            <w:proofErr w:type="spellStart"/>
-            <w:r>
-              <w:rPr>
-                <w:color w:val="000000"/>
-                <w:lang w:val="en-US"/>
-              </w:rPr>
-              <w:t>Pydantic</w:t>
-            </w:r>
-            <w:proofErr w:type="spellEnd"/>
-            <w:r>
-              <w:rPr>
-                <w:color w:val="000000"/>
-                <w:lang w:val="en-US"/>
-              </w:rPr>
-              <w:t xml:space="preserve"> · </w:t>
-            </w:r>
-            <w:proofErr w:type="spellStart"/>
-            <w:r>
-              <w:rPr>
-                <w:color w:val="000000"/>
-                <w:lang w:val="en-US"/>
-              </w:rPr>
-              <w:t>PyMongo</w:t>
-            </w:r>
-            <w:proofErr w:type="spellEnd"/>
-            <w:r>
-              <w:rPr>
-                <w:color w:val="000000"/>
-                <w:lang w:val="en-US"/>
-              </w:rPr>
-              <w:t xml:space="preserve"> · Python-</w:t>
-            </w:r>
-            <w:proofErr w:type="spellStart"/>
-            <w:r>
-              <w:rPr>
-                <w:color w:val="000000"/>
-                <w:lang w:val="en-US"/>
-              </w:rPr>
-              <w:t>dotenv</w:t>
-            </w:r>
-            <w:proofErr w:type="spellEnd"/>
-          </w:p>
-        </w:tc>
-      </w:tr>
-      <w:tr>
-        <w:tblPrEx>
-          <w:tblCellMar>
-            <w:top w:w="0" w:type="dxa"/>
-            <w:bottom w:w="0" w:type="dxa"/>
-          </w:tblCellMar>
-        </w:tblPrEx>
-        <w:tc>
-          <w:tcPr>
-            <w:tcW w:w="2266" w:type="dxa"/>
-            <w:tcBorders>
-              <w:top w:val="single" w:sz="1" w:space="0" w:color="AAAAAA"/>
-              <w:left w:val="single" w:sz="1" w:space="0" w:color="AAAAAA"/>
-              <w:bottom w:val="single" w:sz="1" w:space="0" w:color="AAAAAA"/>
-              <w:right w:val="single" w:sz="1" w:space="0" w:color="AAAAAA"/>
-            </w:tcBorders>
-            <w:shd w:val="clear" w:color="auto" w:fill="E8F4FC"/>
-            <w:tcMar>
-              <w:top w:w="80" w:type="dxa"/>
-              <w:left w:w="120" w:type="dxa"/>
-              <w:bottom w:w="80" w:type="dxa"/>
-              <w:right w:w="120" w:type="dxa"/>
-            </w:tcMar>
-          </w:tcPr>
-          <w:p>
-            <w:r>
-              <w:rPr>
-                <w:b/>
-                <w:bCs/>
-                <w:color w:val="000000"/>
-              </w:rPr>
-              <w:t>Base de datos</w:t>
-            </w:r>
-          </w:p>
-        </w:tc>
-        <w:tc>
-          <w:tcPr>
-            <w:tcW w:w="6554" w:type="dxa"/>
-            <w:tcBorders>
-              <w:top w:val="single" w:sz="1" w:space="0" w:color="AAAAAA"/>
-              <w:left w:val="single" w:sz="1" w:space="0" w:color="AAAAAA"/>
-              <w:bottom w:val="single" w:sz="1" w:space="0" w:color="AAAAAA"/>
-              <w:right w:val="single" w:sz="1" w:space="0" w:color="AAAAAA"/>
-            </w:tcBorders>
-            <w:shd w:val="clear" w:color="auto" w:fill="E8F4FC"/>
-            <w:tcMar>
-              <w:top w:w="80" w:type="dxa"/>
-              <w:left w:w="120" w:type="dxa"/>
-              <w:bottom w:w="80" w:type="dxa"/>
-              <w:right w:w="120" w:type="dxa"/>
-            </w:tcMar>
-          </w:tcPr>
-          <w:p>
-            <w:r>
-              <w:rPr>
-                <w:color w:val="000000"/>
-              </w:rPr>
-              <w:t>MongoDB Atlas (</w:t>
-            </w:r>
-            <w:proofErr w:type="spellStart"/>
-            <w:r>
-              <w:rPr>
-                <w:color w:val="000000"/>
-              </w:rPr>
-              <w:t>cloud</w:t>
-            </w:r>
-            <w:proofErr w:type="spellEnd"/>
-            <w:r>
-              <w:rPr>
-                <w:color w:val="000000"/>
-              </w:rPr>
-              <w:t xml:space="preserve">) con Schema </w:t>
-            </w:r>
-            <w:proofErr w:type="spellStart"/>
-            <w:r>
-              <w:rPr>
-                <w:color w:val="000000"/>
-              </w:rPr>
-              <w:t>Validator</w:t>
-            </w:r>
-            <w:proofErr w:type="spellEnd"/>
-            <w:r>
-              <w:rPr>
-                <w:color w:val="000000"/>
-              </w:rPr>
-              <w:t xml:space="preserve"> configurado</w:t>
-            </w:r>
-          </w:p>
-        </w:tc>
-      </w:tr>
-      <w:tr>
-        <w:tblPrEx>
-          <w:tblCellMar>
-            <w:top w:w="0" w:type="dxa"/>
-            <w:bottom w:w="0" w:type="dxa"/>
-          </w:tblCellMar>
-        </w:tblPrEx>
-        <w:tc>
-          <w:tcPr>
-            <w:tcW w:w="2266" w:type="dxa"/>
-            <w:tcBorders>
-              <w:top w:val="single" w:sz="1" w:space="0" w:color="AAAAAA"/>
-              <w:left w:val="single" w:sz="1" w:space="0" w:color="AAAAAA"/>
-              <w:bottom w:val="single" w:sz="1" w:space="0" w:color="AAAAAA"/>
-              <w:right w:val="single" w:sz="1" w:space="0" w:color="AAAAAA"/>
-            </w:tcBorders>
-            <w:shd w:val="clear" w:color="auto" w:fill="FFFFFF"/>
-            <w:tcMar>
-              <w:top w:w="80" w:type="dxa"/>
-              <w:left w:w="120" w:type="dxa"/>
-              <w:bottom w:w="80" w:type="dxa"/>
-              <w:right w:w="120" w:type="dxa"/>
-            </w:tcMar>
-          </w:tcPr>
-          <w:p>
-            <w:r>
-              <w:rPr>
-                <w:b/>
-                <w:bCs/>
-                <w:color w:val="000000"/>
-              </w:rPr>
-              <w:t xml:space="preserve">Tecnologías </w:t>
-            </w:r>
-            <w:proofErr w:type="spellStart"/>
-            <w:r>
-              <w:rPr>
-                <w:b/>
-                <w:bCs/>
-                <w:color w:val="000000"/>
-              </w:rPr>
-              <w:t>frontend</w:t>
-            </w:r>
-            <w:proofErr w:type="spellEnd"/>
-          </w:p>
-        </w:tc>
-        <w:tc>
-          <w:tcPr>
-            <w:tcW w:w="6554" w:type="dxa"/>
-            <w:tcBorders>
-              <w:top w:val="single" w:sz="1" w:space="0" w:color="AAAAAA"/>
-              <w:left w:val="single" w:sz="1" w:space="0" w:color="AAAAAA"/>
-              <w:bottom w:val="single" w:sz="1" w:space="0" w:color="AAAAAA"/>
-              <w:right w:val="single" w:sz="1" w:space="0" w:color="AAAAAA"/>
-            </w:tcBorders>
-            <w:shd w:val="clear" w:color="auto" w:fill="FFFFFF"/>
-            <w:tcMar>
-              <w:top w:w="80" w:type="dxa"/>
-              <w:left w:w="120" w:type="dxa"/>
-              <w:bottom w:w="80" w:type="dxa"/>
-              <w:right w:w="120" w:type="dxa"/>
-            </w:tcMar>
-          </w:tcPr>
-          <w:p>
-            <w:pPr>
-              <w:rPr>
-                <w:lang w:val="en-US"/>
-              </w:rPr>
-            </w:pPr>
-            <w:r>
-              <w:rPr>
-                <w:color w:val="000000"/>
-                <w:lang w:val="en-US"/>
-              </w:rPr>
-              <w:t xml:space="preserve">HTML5 · CSS3 · JavaScript puro (ES </w:t>
-            </w:r>
-            <w:proofErr w:type="gramStart"/>
-            <w:r>
-              <w:rPr>
-                <w:color w:val="000000"/>
-                <w:lang w:val="en-US"/>
-              </w:rPr>
-              <w:t>Modules) ·</w:t>
-            </w:r>
-            <w:proofErr w:type="gramEnd"/>
-            <w:r>
-              <w:rPr>
-                <w:color w:val="000000"/>
-                <w:lang w:val="en-US"/>
-              </w:rPr>
-              <w:t xml:space="preserve"> </w:t>
-            </w:r>
-            <w:proofErr w:type="spellStart"/>
-            <w:r>
-              <w:rPr>
-                <w:color w:val="000000"/>
-                <w:lang w:val="en-US"/>
-              </w:rPr>
-              <w:t>TailwindCSS</w:t>
-            </w:r>
-            <w:proofErr w:type="spellEnd"/>
-            <w:r>
-              <w:rPr>
-                <w:color w:val="000000"/>
-                <w:lang w:val="en-US"/>
-              </w:rPr>
-              <w:t xml:space="preserve"> (CDN)</w:t>
-            </w:r>
-          </w:p>
-        </w:tc>
-      </w:tr>
-      <w:tr>
-        <w:tblPrEx>
-          <w:tblCellMar>
-            <w:top w:w="0" w:type="dxa"/>
-            <w:bottom w:w="0" w:type="dxa"/>
-          </w:tblCellMar>
-        </w:tblPrEx>
-        <w:tc>
-          <w:tcPr>
-            <w:tcW w:w="2266" w:type="dxa"/>
-            <w:tcBorders>
-              <w:top w:val="single" w:sz="1" w:space="0" w:color="AAAAAA"/>
-              <w:left w:val="single" w:sz="1" w:space="0" w:color="AAAAAA"/>
-              <w:bottom w:val="single" w:sz="1" w:space="0" w:color="AAAAAA"/>
-              <w:right w:val="single" w:sz="1" w:space="0" w:color="AAAAAA"/>
-            </w:tcBorders>
-            <w:shd w:val="clear" w:color="auto" w:fill="E8F4FC"/>
-            <w:tcMar>
-              <w:top w:w="80" w:type="dxa"/>
-              <w:left w:w="120" w:type="dxa"/>
-              <w:bottom w:w="80" w:type="dxa"/>
-              <w:right w:w="120" w:type="dxa"/>
-            </w:tcMar>
-          </w:tcPr>
-          <w:p>
-            <w:r>
-              <w:rPr>
-                <w:b/>
-                <w:bCs/>
-                <w:color w:val="000000"/>
-              </w:rPr>
-              <w:t>Sistemas operativos compatibles</w:t>
-            </w:r>
-          </w:p>
-        </w:tc>
-        <w:tc>
-          <w:tcPr>
-            <w:tcW w:w="6554" w:type="dxa"/>
-            <w:tcBorders>
-              <w:top w:val="single" w:sz="1" w:space="0" w:color="AAAAAA"/>
-              <w:left w:val="single" w:sz="1" w:space="0" w:color="AAAAAA"/>
-              <w:bottom w:val="single" w:sz="1" w:space="0" w:color="AAAAAA"/>
-              <w:right w:val="single" w:sz="1" w:space="0" w:color="AAAAAA"/>
-            </w:tcBorders>
-            <w:shd w:val="clear" w:color="auto" w:fill="E8F4FC"/>
-            <w:tcMar>
-              <w:top w:w="80" w:type="dxa"/>
-              <w:left w:w="120" w:type="dxa"/>
-              <w:bottom w:w="80" w:type="dxa"/>
-              <w:right w:w="120" w:type="dxa"/>
-            </w:tcMar>
-          </w:tcPr>
-          <w:p>
-            <w:r>
-              <w:rPr>
-                <w:color w:val="000000"/>
-              </w:rPr>
-              <w:t>Windows 10/11 · macOS · Ubuntu (cualquier SO con Python 3.11+)</w:t>
-            </w:r>
-          </w:p>
-        </w:tc>
-      </w:tr>
-      <w:tr>
-        <w:tblPrEx>
-          <w:tblCellMar>
-            <w:top w:w="0" w:type="dxa"/>
-            <w:bottom w:w="0" w:type="dxa"/>
-          </w:tblCellMar>
-        </w:tblPrEx>
-        <w:tc>
-          <w:tcPr>
-            <w:tcW w:w="2266" w:type="dxa"/>
-            <w:tcBorders>
-              <w:top w:val="single" w:sz="1" w:space="0" w:color="AAAAAA"/>
-              <w:left w:val="single" w:sz="1" w:space="0" w:color="AAAAAA"/>
-              <w:bottom w:val="single" w:sz="1" w:space="0" w:color="AAAAAA"/>
-              <w:right w:val="single" w:sz="1" w:space="0" w:color="AAAAAA"/>
-            </w:tcBorders>
-            <w:shd w:val="clear" w:color="auto" w:fill="FFFFFF"/>
-            <w:tcMar>
-              <w:top w:w="80" w:type="dxa"/>
-              <w:left w:w="120" w:type="dxa"/>
-              <w:bottom w:w="80" w:type="dxa"/>
-              <w:right w:w="120" w:type="dxa"/>
-            </w:tcMar>
-          </w:tcPr>
-          <w:p>
-            <w:r>
-              <w:rPr>
-                <w:b/>
-                <w:bCs/>
-                <w:color w:val="000000"/>
-              </w:rPr>
-              <w:t>Requisitos del sistema</w:t>
-            </w:r>
-          </w:p>
-        </w:tc>
-        <w:tc>
-          <w:tcPr>
-            <w:tcW w:w="6554" w:type="dxa"/>
-            <w:tcBorders>
-              <w:top w:val="single" w:sz="1" w:space="0" w:color="AAAAAA"/>
-              <w:left w:val="single" w:sz="1" w:space="0" w:color="AAAAAA"/>
-              <w:bottom w:val="single" w:sz="1" w:space="0" w:color="AAAAAA"/>
-              <w:right w:val="single" w:sz="1" w:space="0" w:color="AAAAAA"/>
-            </w:tcBorders>
-            <w:shd w:val="clear" w:color="auto" w:fill="FFFFFF"/>
-            <w:tcMar>
-              <w:top w:w="80" w:type="dxa"/>
-              <w:left w:w="120" w:type="dxa"/>
-              <w:bottom w:w="80" w:type="dxa"/>
-              <w:right w:w="120" w:type="dxa"/>
-            </w:tcMar>
-          </w:tcPr>
+              <w:t>No existe autenticación de usuarios. El sistema asume uso en entorno interno o de desarrollo.</w:t>
+            </w:r>
+          </w:p>
           <w:p>
             <w:pPr>
               <w:pStyle w:val="Prrafodelista"/>
@@ -1898,7 +826,7 @@
               <w:rPr>
                 <w:color w:val="000000"/>
               </w:rPr>
-              <w:t>Python 3.11 o superior</w:t>
+              <w:t>El frontend no tiene build tools ni optimización de producción. No puede abrirse el archivo index.html con doble clic (los navegadores bloquean los ES Modules vía file://); requiere servirse por HTTP (Live Server, python -m http.server, etc.).</w:t>
             </w:r>
           </w:p>
           <w:p>
@@ -1913,9 +841,677 @@
               <w:rPr>
                 <w:color w:val="000000"/>
               </w:rPr>
-              <w:t>Node.js (solo para desarrollo, no requerido en producción)</w:t>
-            </w:r>
-          </w:p>
+              <w:t>La detección automática de lugar exige que todas las palabras significativas del nombre del lugar aparezcan en el texto del recurso, por lo que su tasa de acierto es baja (~5% de los recursos). La detección de edición es más flexible y hoy cubre ~94% de los recursos. La asignación manual sigue disponible desde el editor de recursos.</w:t>
+            </w:r>
+          </w:p>
+        </w:tc>
+      </w:tr>
+      <w:tr>
+        <w:tc>
+          <w:tcPr>
+            <w:tcW w:w="2266" w:type="dxa"/>
+            <w:tcBorders>
+              <w:top w:val="single" w:sz="1" w:space="0" w:color="AAAAAA"/>
+              <w:left w:val="single" w:sz="1" w:space="0" w:color="AAAAAA"/>
+              <w:bottom w:val="single" w:sz="1" w:space="0" w:color="AAAAAA"/>
+              <w:right w:val="single" w:sz="1" w:space="0" w:color="AAAAAA"/>
+            </w:tcBorders>
+            <w:shd w:val="clear" w:color="auto" w:fill="FFFFFF"/>
+            <w:tcMar>
+              <w:top w:w="80" w:type="dxa"/>
+              <w:left w:w="120" w:type="dxa"/>
+              <w:bottom w:w="80" w:type="dxa"/>
+              <w:right w:w="120" w:type="dxa"/>
+            </w:tcMar>
+          </w:tcPr>
+          <w:p>
+            <w:r>
+              <w:rPr>
+                <w:b/>
+                <w:bCs/>
+                <w:color w:val="000000"/>
+              </w:rPr>
+              <w:t>Fecha de creación</w:t>
+            </w:r>
+          </w:p>
+        </w:tc>
+        <w:tc>
+          <w:tcPr>
+            <w:tcW w:w="6554" w:type="dxa"/>
+            <w:tcBorders>
+              <w:top w:val="single" w:sz="1" w:space="0" w:color="AAAAAA"/>
+              <w:left w:val="single" w:sz="1" w:space="0" w:color="AAAAAA"/>
+              <w:bottom w:val="single" w:sz="1" w:space="0" w:color="AAAAAA"/>
+              <w:right w:val="single" w:sz="1" w:space="0" w:color="AAAAAA"/>
+            </w:tcBorders>
+            <w:shd w:val="clear" w:color="auto" w:fill="FFFFFF"/>
+            <w:tcMar>
+              <w:top w:w="80" w:type="dxa"/>
+              <w:left w:w="120" w:type="dxa"/>
+              <w:bottom w:w="80" w:type="dxa"/>
+              <w:right w:w="120" w:type="dxa"/>
+            </w:tcMar>
+          </w:tcPr>
+          <w:p>
+            <w:r>
+              <w:rPr>
+                <w:color w:val="000000"/>
+              </w:rPr>
+              <w:t>Mayo</w:t>
+            </w:r>
+            <w:r>
+              <w:rPr>
+                <w:color w:val="000000"/>
+              </w:rPr>
+              <w:t xml:space="preserve"> 2026</w:t>
+            </w:r>
+          </w:p>
+        </w:tc>
+      </w:tr>
+      <w:tr>
+        <w:tc>
+          <w:tcPr>
+            <w:tcW w:w="2266" w:type="dxa"/>
+            <w:tcBorders>
+              <w:top w:val="single" w:sz="1" w:space="0" w:color="AAAAAA"/>
+              <w:left w:val="single" w:sz="1" w:space="0" w:color="AAAAAA"/>
+              <w:bottom w:val="single" w:sz="1" w:space="0" w:color="AAAAAA"/>
+              <w:right w:val="single" w:sz="1" w:space="0" w:color="AAAAAA"/>
+            </w:tcBorders>
+            <w:shd w:val="clear" w:color="auto" w:fill="E8F4FC"/>
+            <w:tcMar>
+              <w:top w:w="80" w:type="dxa"/>
+              <w:left w:w="120" w:type="dxa"/>
+              <w:bottom w:w="80" w:type="dxa"/>
+              <w:right w:w="120" w:type="dxa"/>
+            </w:tcMar>
+          </w:tcPr>
+          <w:p>
+            <w:r>
+              <w:rPr>
+                <w:b/>
+                <w:bCs/>
+                <w:color w:val="000000"/>
+              </w:rPr>
+              <w:t>Fecha de última actualización</w:t>
+            </w:r>
+          </w:p>
+        </w:tc>
+        <w:tc>
+          <w:tcPr>
+            <w:tcW w:w="6554" w:type="dxa"/>
+            <w:tcBorders>
+              <w:top w:val="single" w:sz="1" w:space="0" w:color="AAAAAA"/>
+              <w:left w:val="single" w:sz="1" w:space="0" w:color="AAAAAA"/>
+              <w:bottom w:val="single" w:sz="1" w:space="0" w:color="AAAAAA"/>
+              <w:right w:val="single" w:sz="1" w:space="0" w:color="AAAAAA"/>
+            </w:tcBorders>
+            <w:shd w:val="clear" w:color="auto" w:fill="E8F4FC"/>
+            <w:tcMar>
+              <w:top w:w="80" w:type="dxa"/>
+              <w:left w:w="120" w:type="dxa"/>
+              <w:bottom w:w="80" w:type="dxa"/>
+              <w:right w:w="120" w:type="dxa"/>
+            </w:tcMar>
+          </w:tcPr>
+          <w:p>
+            <w:r>
+              <w:rPr>
+                <w:color w:val="000000"/>
+              </w:rPr>
+              <w:t>Julio 2026</w:t>
+            </w:r>
+          </w:p>
+        </w:tc>
+      </w:tr>
+      <w:tr>
+        <w:tc>
+          <w:tcPr>
+            <w:tcW w:w="2266" w:type="dxa"/>
+            <w:tcBorders>
+              <w:top w:val="single" w:sz="1" w:space="0" w:color="AAAAAA"/>
+              <w:left w:val="single" w:sz="1" w:space="0" w:color="AAAAAA"/>
+              <w:bottom w:val="single" w:sz="1" w:space="0" w:color="AAAAAA"/>
+              <w:right w:val="single" w:sz="1" w:space="0" w:color="AAAAAA"/>
+            </w:tcBorders>
+            <w:shd w:val="clear" w:color="auto" w:fill="FFFFFF"/>
+            <w:tcMar>
+              <w:top w:w="80" w:type="dxa"/>
+              <w:left w:w="120" w:type="dxa"/>
+              <w:bottom w:w="80" w:type="dxa"/>
+              <w:right w:w="120" w:type="dxa"/>
+            </w:tcMar>
+          </w:tcPr>
+          <w:p>
+            <w:r>
+              <w:rPr>
+                <w:b/>
+                <w:bCs/>
+                <w:color w:val="000000"/>
+              </w:rPr>
+              <w:t>Última versión</w:t>
+            </w:r>
+          </w:p>
+        </w:tc>
+        <w:tc>
+          <w:tcPr>
+            <w:tcW w:w="6554" w:type="dxa"/>
+            <w:tcBorders>
+              <w:top w:val="single" w:sz="1" w:space="0" w:color="AAAAAA"/>
+              <w:left w:val="single" w:sz="1" w:space="0" w:color="AAAAAA"/>
+              <w:bottom w:val="single" w:sz="1" w:space="0" w:color="AAAAAA"/>
+              <w:right w:val="single" w:sz="1" w:space="0" w:color="AAAAAA"/>
+            </w:tcBorders>
+            <w:shd w:val="clear" w:color="auto" w:fill="FFFFFF"/>
+            <w:tcMar>
+              <w:top w:w="80" w:type="dxa"/>
+              <w:left w:w="120" w:type="dxa"/>
+              <w:bottom w:w="80" w:type="dxa"/>
+              <w:right w:w="120" w:type="dxa"/>
+            </w:tcMar>
+          </w:tcPr>
+          <w:p>
+            <w:r>
+              <w:rPr>
+                <w:color w:val="000000"/>
+              </w:rPr>
+              <w:t>2</w:t>
+            </w:r>
+            <w:r>
+              <w:rPr>
+                <w:color w:val="000000"/>
+              </w:rPr>
+              <w:t>.</w:t>
+            </w:r>
+            <w:r>
+              <w:rPr>
+                <w:color w:val="000000"/>
+              </w:rPr>
+              <w:t>0</w:t>
+            </w:r>
+            <w:r>
+              <w:rPr>
+                <w:color w:val="000000"/>
+              </w:rPr>
+              <w:t>.0</w:t>
+            </w:r>
+          </w:p>
+        </w:tc>
+      </w:tr>
+      <w:tr>
+        <w:tc>
+          <w:tcPr>
+            <w:tcW w:w="2266" w:type="dxa"/>
+            <w:tcBorders>
+              <w:top w:val="single" w:sz="1" w:space="0" w:color="AAAAAA"/>
+              <w:left w:val="single" w:sz="1" w:space="0" w:color="AAAAAA"/>
+              <w:bottom w:val="single" w:sz="1" w:space="0" w:color="AAAAAA"/>
+              <w:right w:val="single" w:sz="1" w:space="0" w:color="AAAAAA"/>
+            </w:tcBorders>
+            <w:shd w:val="clear" w:color="auto" w:fill="E8F4FC"/>
+            <w:tcMar>
+              <w:top w:w="80" w:type="dxa"/>
+              <w:left w:w="120" w:type="dxa"/>
+              <w:bottom w:w="80" w:type="dxa"/>
+              <w:right w:w="120" w:type="dxa"/>
+            </w:tcMar>
+          </w:tcPr>
+          <w:p>
+            <w:r>
+              <w:rPr>
+                <w:b/>
+                <w:bCs/>
+                <w:color w:val="000000"/>
+              </w:rPr>
+              <w:t>Última versión de prueba</w:t>
+            </w:r>
+          </w:p>
+        </w:tc>
+        <w:tc>
+          <w:tcPr>
+            <w:tcW w:w="6554" w:type="dxa"/>
+            <w:tcBorders>
+              <w:top w:val="single" w:sz="1" w:space="0" w:color="AAAAAA"/>
+              <w:left w:val="single" w:sz="1" w:space="0" w:color="AAAAAA"/>
+              <w:bottom w:val="single" w:sz="1" w:space="0" w:color="AAAAAA"/>
+              <w:right w:val="single" w:sz="1" w:space="0" w:color="AAAAAA"/>
+            </w:tcBorders>
+            <w:shd w:val="clear" w:color="auto" w:fill="E8F4FC"/>
+            <w:tcMar>
+              <w:top w:w="80" w:type="dxa"/>
+              <w:left w:w="120" w:type="dxa"/>
+              <w:bottom w:w="80" w:type="dxa"/>
+              <w:right w:w="120" w:type="dxa"/>
+            </w:tcMar>
+          </w:tcPr>
+          <w:p>
+            <w:r>
+              <w:rPr>
+                <w:color w:val="000000"/>
+              </w:rPr>
+              <w:t>2.0</w:t>
+            </w:r>
+            <w:r>
+              <w:rPr>
+                <w:color w:val="000000"/>
+              </w:rPr>
+              <w:t>.0</w:t>
+            </w:r>
+          </w:p>
+        </w:tc>
+      </w:tr>
+      <w:tr>
+        <w:tc>
+          <w:tcPr>
+            <w:tcW w:w="2266" w:type="dxa"/>
+            <w:tcBorders>
+              <w:top w:val="single" w:sz="1" w:space="0" w:color="AAAAAA"/>
+              <w:left w:val="single" w:sz="1" w:space="0" w:color="AAAAAA"/>
+              <w:bottom w:val="single" w:sz="1" w:space="0" w:color="AAAAAA"/>
+              <w:right w:val="single" w:sz="1" w:space="0" w:color="AAAAAA"/>
+            </w:tcBorders>
+            <w:shd w:val="clear" w:color="auto" w:fill="FFFFFF"/>
+            <w:tcMar>
+              <w:top w:w="80" w:type="dxa"/>
+              <w:left w:w="120" w:type="dxa"/>
+              <w:bottom w:w="80" w:type="dxa"/>
+              <w:right w:w="120" w:type="dxa"/>
+            </w:tcMar>
+          </w:tcPr>
+          <w:p>
+            <w:r>
+              <w:rPr>
+                <w:b/>
+                <w:bCs/>
+                <w:color w:val="000000"/>
+              </w:rPr>
+              <w:t>Género</w:t>
+            </w:r>
+          </w:p>
+        </w:tc>
+        <w:tc>
+          <w:tcPr>
+            <w:tcW w:w="6554" w:type="dxa"/>
+            <w:tcBorders>
+              <w:top w:val="single" w:sz="1" w:space="0" w:color="AAAAAA"/>
+              <w:left w:val="single" w:sz="1" w:space="0" w:color="AAAAAA"/>
+              <w:bottom w:val="single" w:sz="1" w:space="0" w:color="AAAAAA"/>
+              <w:right w:val="single" w:sz="1" w:space="0" w:color="AAAAAA"/>
+            </w:tcBorders>
+            <w:shd w:val="clear" w:color="auto" w:fill="FFFFFF"/>
+            <w:tcMar>
+              <w:top w:w="80" w:type="dxa"/>
+              <w:left w:w="120" w:type="dxa"/>
+              <w:bottom w:w="80" w:type="dxa"/>
+              <w:right w:w="120" w:type="dxa"/>
+            </w:tcMar>
+          </w:tcPr>
+          <w:p>
+            <w:r>
+              <w:rPr>
+                <w:color w:val="000000"/>
+              </w:rPr>
+              <w:t xml:space="preserve">Aplicación web </w:t>
+            </w:r>
+            <w:r>
+              <w:rPr>
+                <w:color w:val="000000"/>
+              </w:rPr>
+              <w:t>-</w:t>
+            </w:r>
+            <w:r>
+              <w:rPr>
+                <w:color w:val="000000"/>
+              </w:rPr>
+              <w:t xml:space="preserve"> Gestión de datos / ETL / Turismo</w:t>
+            </w:r>
+          </w:p>
+        </w:tc>
+      </w:tr>
+      <w:tr>
+        <w:tc>
+          <w:tcPr>
+            <w:tcW w:w="2266" w:type="dxa"/>
+            <w:tcBorders>
+              <w:top w:val="single" w:sz="1" w:space="0" w:color="AAAAAA"/>
+              <w:left w:val="single" w:sz="1" w:space="0" w:color="AAAAAA"/>
+              <w:bottom w:val="single" w:sz="1" w:space="0" w:color="AAAAAA"/>
+              <w:right w:val="single" w:sz="1" w:space="0" w:color="AAAAAA"/>
+            </w:tcBorders>
+            <w:shd w:val="clear" w:color="auto" w:fill="E8F4FC"/>
+            <w:tcMar>
+              <w:top w:w="80" w:type="dxa"/>
+              <w:left w:w="120" w:type="dxa"/>
+              <w:bottom w:w="80" w:type="dxa"/>
+              <w:right w:w="120" w:type="dxa"/>
+            </w:tcMar>
+          </w:tcPr>
+          <w:p>
+            <w:r>
+              <w:rPr>
+                <w:b/>
+                <w:bCs/>
+                <w:color w:val="000000"/>
+              </w:rPr>
+              <w:t>Lenguaje de programación</w:t>
+            </w:r>
+          </w:p>
+        </w:tc>
+        <w:tc>
+          <w:tcPr>
+            <w:tcW w:w="6554" w:type="dxa"/>
+            <w:tcBorders>
+              <w:top w:val="single" w:sz="1" w:space="0" w:color="AAAAAA"/>
+              <w:left w:val="single" w:sz="1" w:space="0" w:color="AAAAAA"/>
+              <w:bottom w:val="single" w:sz="1" w:space="0" w:color="AAAAAA"/>
+              <w:right w:val="single" w:sz="1" w:space="0" w:color="AAAAAA"/>
+            </w:tcBorders>
+            <w:shd w:val="clear" w:color="auto" w:fill="E8F4FC"/>
+            <w:tcMar>
+              <w:top w:w="80" w:type="dxa"/>
+              <w:left w:w="120" w:type="dxa"/>
+              <w:bottom w:w="80" w:type="dxa"/>
+              <w:right w:w="120" w:type="dxa"/>
+            </w:tcMar>
+          </w:tcPr>
+          <w:p>
+            <w:pPr>
+              <w:rPr>
+                <w:lang w:val="en-US"/>
+              </w:rPr>
+            </w:pPr>
+            <w:r>
+              <w:rPr>
+                <w:color w:val="000000"/>
+                <w:lang w:val="en-US"/>
+              </w:rPr>
+              <w:t>Python 3.11 (backend) · JavaScript ES2022 (frontend)</w:t>
+            </w:r>
+          </w:p>
+        </w:tc>
+      </w:tr>
+      <w:tr>
+        <w:tc>
+          <w:tcPr>
+            <w:tcW w:w="2266" w:type="dxa"/>
+            <w:tcBorders>
+              <w:top w:val="single" w:sz="1" w:space="0" w:color="AAAAAA"/>
+              <w:left w:val="single" w:sz="1" w:space="0" w:color="AAAAAA"/>
+              <w:bottom w:val="single" w:sz="1" w:space="0" w:color="AAAAAA"/>
+              <w:right w:val="single" w:sz="1" w:space="0" w:color="AAAAAA"/>
+            </w:tcBorders>
+            <w:shd w:val="clear" w:color="auto" w:fill="FFFFFF"/>
+            <w:tcMar>
+              <w:top w:w="80" w:type="dxa"/>
+              <w:left w:w="120" w:type="dxa"/>
+              <w:bottom w:w="80" w:type="dxa"/>
+              <w:right w:w="120" w:type="dxa"/>
+            </w:tcMar>
+          </w:tcPr>
+          <w:p>
+            <w:r>
+              <w:rPr>
+                <w:b/>
+                <w:bCs/>
+                <w:color w:val="000000"/>
+              </w:rPr>
+              <w:t>Frameworks y librerías</w:t>
+            </w:r>
+          </w:p>
+        </w:tc>
+        <w:tc>
+          <w:tcPr>
+            <w:tcW w:w="6554" w:type="dxa"/>
+            <w:tcBorders>
+              <w:top w:val="single" w:sz="1" w:space="0" w:color="AAAAAA"/>
+              <w:left w:val="single" w:sz="1" w:space="0" w:color="AAAAAA"/>
+              <w:bottom w:val="single" w:sz="1" w:space="0" w:color="AAAAAA"/>
+              <w:right w:val="single" w:sz="1" w:space="0" w:color="AAAAAA"/>
+            </w:tcBorders>
+            <w:shd w:val="clear" w:color="auto" w:fill="FFFFFF"/>
+            <w:tcMar>
+              <w:top w:w="80" w:type="dxa"/>
+              <w:left w:w="120" w:type="dxa"/>
+              <w:bottom w:w="80" w:type="dxa"/>
+              <w:right w:w="120" w:type="dxa"/>
+            </w:tcMar>
+          </w:tcPr>
+          <w:p>
+            <w:pPr>
+              <w:rPr>
+                <w:lang w:val="en-US"/>
+              </w:rPr>
+            </w:pPr>
+            <w:r>
+              <w:rPr>
+                <w:color w:val="000000"/>
+                <w:lang w:val="en-US"/>
+              </w:rPr>
+              <w:t>FastAPI · Uvicorn · Pydantic · PyMongo · Python-dotenv · Requests</w:t>
+            </w:r>
+          </w:p>
+        </w:tc>
+      </w:tr>
+      <w:tr>
+        <w:tc>
+          <w:tcPr>
+            <w:tcW w:w="2266" w:type="dxa"/>
+            <w:tcBorders>
+              <w:top w:val="single" w:sz="1" w:space="0" w:color="AAAAAA"/>
+              <w:left w:val="single" w:sz="1" w:space="0" w:color="AAAAAA"/>
+              <w:bottom w:val="single" w:sz="1" w:space="0" w:color="AAAAAA"/>
+              <w:right w:val="single" w:sz="1" w:space="0" w:color="AAAAAA"/>
+            </w:tcBorders>
+            <w:shd w:val="clear" w:color="auto" w:fill="E8F4FC"/>
+            <w:tcMar>
+              <w:top w:w="80" w:type="dxa"/>
+              <w:left w:w="120" w:type="dxa"/>
+              <w:bottom w:w="80" w:type="dxa"/>
+              <w:right w:w="120" w:type="dxa"/>
+            </w:tcMar>
+          </w:tcPr>
+          <w:p>
+            <w:r>
+              <w:rPr>
+                <w:b/>
+                <w:bCs/>
+                <w:color w:val="000000"/>
+              </w:rPr>
+              <w:t>Base de datos</w:t>
+            </w:r>
+          </w:p>
+        </w:tc>
+        <w:tc>
+          <w:tcPr>
+            <w:tcW w:w="6554" w:type="dxa"/>
+            <w:tcBorders>
+              <w:top w:val="single" w:sz="1" w:space="0" w:color="AAAAAA"/>
+              <w:left w:val="single" w:sz="1" w:space="0" w:color="AAAAAA"/>
+              <w:bottom w:val="single" w:sz="1" w:space="0" w:color="AAAAAA"/>
+              <w:right w:val="single" w:sz="1" w:space="0" w:color="AAAAAA"/>
+            </w:tcBorders>
+            <w:shd w:val="clear" w:color="auto" w:fill="E8F4FC"/>
+            <w:tcMar>
+              <w:top w:w="80" w:type="dxa"/>
+              <w:left w:w="120" w:type="dxa"/>
+              <w:bottom w:w="80" w:type="dxa"/>
+              <w:right w:w="120" w:type="dxa"/>
+            </w:tcMar>
+          </w:tcPr>
+          <w:p>
+            <w:r>
+              <w:rPr>
+                <w:color w:val="000000"/>
+              </w:rPr>
+              <w:t>MongoDB Atlas (cloud) con Schema Validator configurado</w:t>
+            </w:r>
+          </w:p>
+        </w:tc>
+      </w:tr>
+      <w:tr>
+        <w:tc>
+          <w:tcPr>
+            <w:tcW w:w="2266" w:type="dxa"/>
+            <w:tcBorders>
+              <w:top w:val="single" w:sz="1" w:space="0" w:color="AAAAAA"/>
+              <w:left w:val="single" w:sz="1" w:space="0" w:color="AAAAAA"/>
+              <w:bottom w:val="single" w:sz="1" w:space="0" w:color="AAAAAA"/>
+              <w:right w:val="single" w:sz="1" w:space="0" w:color="AAAAAA"/>
+            </w:tcBorders>
+            <w:shd w:val="clear" w:color="auto" w:fill="FFFFFF"/>
+            <w:tcMar>
+              <w:top w:w="80" w:type="dxa"/>
+              <w:left w:w="120" w:type="dxa"/>
+              <w:bottom w:w="80" w:type="dxa"/>
+              <w:right w:w="120" w:type="dxa"/>
+            </w:tcMar>
+          </w:tcPr>
+          <w:p>
+            <w:r>
+              <w:rPr>
+                <w:b/>
+                <w:bCs/>
+                <w:color w:val="000000"/>
+              </w:rPr>
+              <w:t>Tecnologías frontend</w:t>
+            </w:r>
+          </w:p>
+        </w:tc>
+        <w:tc>
+          <w:tcPr>
+            <w:tcW w:w="6554" w:type="dxa"/>
+            <w:tcBorders>
+              <w:top w:val="single" w:sz="1" w:space="0" w:color="AAAAAA"/>
+              <w:left w:val="single" w:sz="1" w:space="0" w:color="AAAAAA"/>
+              <w:bottom w:val="single" w:sz="1" w:space="0" w:color="AAAAAA"/>
+              <w:right w:val="single" w:sz="1" w:space="0" w:color="AAAAAA"/>
+            </w:tcBorders>
+            <w:shd w:val="clear" w:color="auto" w:fill="FFFFFF"/>
+            <w:tcMar>
+              <w:top w:w="80" w:type="dxa"/>
+              <w:left w:w="120" w:type="dxa"/>
+              <w:bottom w:w="80" w:type="dxa"/>
+              <w:right w:w="120" w:type="dxa"/>
+            </w:tcMar>
+          </w:tcPr>
+          <w:p>
+            <w:pPr>
+              <w:rPr>
+                <w:lang w:val="en-US"/>
+              </w:rPr>
+            </w:pPr>
+            <w:r>
+              <w:rPr>
+                <w:color w:val="000000"/>
+                <w:lang w:val="en-US"/>
+              </w:rPr>
+              <w:t>HTML5 · CSS3 · JavaScript puro (ES Modules) · TailwindCSS (CDN)</w:t>
+            </w:r>
+          </w:p>
+        </w:tc>
+      </w:tr>
+      <w:tr>
+        <w:tc>
+          <w:tcPr>
+            <w:tcW w:w="2266" w:type="dxa"/>
+            <w:tcBorders>
+              <w:top w:val="single" w:sz="1" w:space="0" w:color="AAAAAA"/>
+              <w:left w:val="single" w:sz="1" w:space="0" w:color="AAAAAA"/>
+              <w:bottom w:val="single" w:sz="1" w:space="0" w:color="AAAAAA"/>
+              <w:right w:val="single" w:sz="1" w:space="0" w:color="AAAAAA"/>
+            </w:tcBorders>
+            <w:shd w:val="clear" w:color="auto" w:fill="E8F4FC"/>
+            <w:tcMar>
+              <w:top w:w="80" w:type="dxa"/>
+              <w:left w:w="120" w:type="dxa"/>
+              <w:bottom w:w="80" w:type="dxa"/>
+              <w:right w:w="120" w:type="dxa"/>
+            </w:tcMar>
+          </w:tcPr>
+          <w:p>
+            <w:r>
+              <w:rPr>
+                <w:b/>
+                <w:bCs/>
+                <w:color w:val="000000"/>
+              </w:rPr>
+              <w:t>Sistemas operativos compatibles</w:t>
+            </w:r>
+          </w:p>
+        </w:tc>
+        <w:tc>
+          <w:tcPr>
+            <w:tcW w:w="6554" w:type="dxa"/>
+            <w:tcBorders>
+              <w:top w:val="single" w:sz="1" w:space="0" w:color="AAAAAA"/>
+              <w:left w:val="single" w:sz="1" w:space="0" w:color="AAAAAA"/>
+              <w:bottom w:val="single" w:sz="1" w:space="0" w:color="AAAAAA"/>
+              <w:right w:val="single" w:sz="1" w:space="0" w:color="AAAAAA"/>
+            </w:tcBorders>
+            <w:shd w:val="clear" w:color="auto" w:fill="E8F4FC"/>
+            <w:tcMar>
+              <w:top w:w="80" w:type="dxa"/>
+              <w:left w:w="120" w:type="dxa"/>
+              <w:bottom w:w="80" w:type="dxa"/>
+              <w:right w:w="120" w:type="dxa"/>
+            </w:tcMar>
+          </w:tcPr>
+          <w:p>
+            <w:r>
+              <w:rPr>
+                <w:color w:val="000000"/>
+              </w:rPr>
+              <w:t>Windows 10/11 · macOS · Ubuntu (cualquier SO con Python 3.11+)</w:t>
+            </w:r>
+          </w:p>
+        </w:tc>
+      </w:tr>
+      <w:tr>
+        <w:tc>
+          <w:tcPr>
+            <w:tcW w:w="2266" w:type="dxa"/>
+            <w:tcBorders>
+              <w:top w:val="single" w:sz="1" w:space="0" w:color="AAAAAA"/>
+              <w:left w:val="single" w:sz="1" w:space="0" w:color="AAAAAA"/>
+              <w:bottom w:val="single" w:sz="1" w:space="0" w:color="AAAAAA"/>
+              <w:right w:val="single" w:sz="1" w:space="0" w:color="AAAAAA"/>
+            </w:tcBorders>
+            <w:shd w:val="clear" w:color="auto" w:fill="FFFFFF"/>
+            <w:tcMar>
+              <w:top w:w="80" w:type="dxa"/>
+              <w:left w:w="120" w:type="dxa"/>
+              <w:bottom w:w="80" w:type="dxa"/>
+              <w:right w:w="120" w:type="dxa"/>
+            </w:tcMar>
+          </w:tcPr>
+          <w:p>
+            <w:r>
+              <w:rPr>
+                <w:b/>
+                <w:bCs/>
+                <w:color w:val="000000"/>
+              </w:rPr>
+              <w:t>Requisitos del sistema</w:t>
+            </w:r>
+          </w:p>
+        </w:tc>
+        <w:tc>
+          <w:tcPr>
+            <w:tcW w:w="6554" w:type="dxa"/>
+            <w:tcBorders>
+              <w:top w:val="single" w:sz="1" w:space="0" w:color="AAAAAA"/>
+              <w:left w:val="single" w:sz="1" w:space="0" w:color="AAAAAA"/>
+              <w:bottom w:val="single" w:sz="1" w:space="0" w:color="AAAAAA"/>
+              <w:right w:val="single" w:sz="1" w:space="0" w:color="AAAAAA"/>
+            </w:tcBorders>
+            <w:shd w:val="clear" w:color="auto" w:fill="FFFFFF"/>
+            <w:tcMar>
+              <w:top w:w="80" w:type="dxa"/>
+              <w:left w:w="120" w:type="dxa"/>
+              <w:bottom w:w="80" w:type="dxa"/>
+              <w:right w:w="120" w:type="dxa"/>
+            </w:tcMar>
+          </w:tcPr>
           <w:p>
             <w:pPr>
               <w:pStyle w:val="Prrafodelista"/>
@@ -1928,21 +1524,7 @@
               <w:rPr>
                 <w:color w:val="000000"/>
               </w:rPr>
-              <w:t xml:space="preserve">Conexión a Internet (para MongoDB Atlas y </w:t>
-            </w:r>
-            <w:proofErr w:type="spellStart"/>
-            <w:r>
-              <w:rPr>
-                <w:color w:val="000000"/>
-              </w:rPr>
-              <w:t>APIs</w:t>
-            </w:r>
-            <w:proofErr w:type="spellEnd"/>
-            <w:r>
-              <w:rPr>
-                <w:color w:val="000000"/>
-              </w:rPr>
-              <w:t xml:space="preserve"> externas)</w:t>
+              <w:t>Python 3.11 o superior</w:t>
             </w:r>
           </w:p>
           <w:p>
@@ -1957,7 +1539,7 @@
               <w:rPr>
                 <w:color w:val="000000"/>
               </w:rPr>
-              <w:t>Navegador moderno con soporte ES Modules (Chrome 90+, Firefox 90+, Edge 90+)</w:t>
+              <w:t>Node.js (solo para desarrollo, no requerido en producción)</w:t>
             </w:r>
           </w:p>
           <w:p>
@@ -1972,18 +1554,43 @@
               <w:rPr>
                 <w:color w:val="000000"/>
               </w:rPr>
-              <w:t>VS Code con extensión Live Server (para desarrollo local)</w:t>
+              <w:t>Conexión a Internet (para MongoDB Atlas y APIs externas)</w:t>
+            </w:r>
+          </w:p>
+          <w:p>
+            <w:pPr>
+              <w:pStyle w:val="Prrafodelista"/>
+              <w:numPr>
+                <w:ilvl w:val="0"/>
+                <w:numId w:val="2"/>
+              </w:numPr>
+            </w:pPr>
+            <w:r>
+              <w:rPr>
+                <w:color w:val="000000"/>
+              </w:rPr>
+              <w:lastRenderedPageBreak/>
+              <w:t>Navegador moderno con soporte ES Modules (Chrome 90+, Firefox 90+, Edge 90+)</w:t>
+            </w:r>
+          </w:p>
+          <w:p>
+            <w:pPr>
+              <w:pStyle w:val="Prrafodelista"/>
+              <w:numPr>
+                <w:ilvl w:val="0"/>
+                <w:numId w:val="2"/>
+              </w:numPr>
+            </w:pPr>
+            <w:r>
+              <w:rPr>
+                <w:color w:val="000000"/>
+              </w:rPr>
+              <w:t>VS Code con extensión Live Server, o cualquier servidor estático (ej. python -m http.server) — para desarrollo local</w:t>
             </w:r>
           </w:p>
         </w:tc>
       </w:tr>
       <w:tr>
-        <w:tblPrEx>
-          <w:tblCellMar>
-            <w:top w:w="0" w:type="dxa"/>
-            <w:bottom w:w="0" w:type="dxa"/>
-          </w:tblCellMar>
-        </w:tblPrEx>
         <w:tc>
           <w:tcPr>
             <w:tcW w:w="2266" w:type="dxa"/>
@@ -2008,6 +1615,7 @@
                 <w:bCs/>
                 <w:color w:val="000000"/>
               </w:rPr>
+              <w:lastRenderedPageBreak/>
               <w:t>Estado</w:t>
             </w:r>
           </w:p>
@@ -2034,18 +1642,48 @@
               <w:rPr>
                 <w:color w:val="000000"/>
               </w:rPr>
-              <w:t>Versión 1.0.0 — Funcional en entorno de desarrollo</w:t>
+              <w:t xml:space="preserve">Versión </w:t>
+            </w:r>
+            <w:r>
+              <w:rPr>
+                <w:color w:val="000000"/>
+              </w:rPr>
+              <w:t>2</w:t>
+            </w:r>
+            <w:r>
+              <w:rPr>
+                <w:color w:val="000000"/>
+              </w:rPr>
+              <w:t>.</w:t>
+            </w:r>
+            <w:r>
+              <w:rPr>
+                <w:color w:val="000000"/>
+              </w:rPr>
+              <w:t>0</w:t>
+            </w:r>
+            <w:r>
+              <w:rPr>
+                <w:color w:val="000000"/>
+              </w:rPr>
+              <w:t xml:space="preserve">.0 </w:t>
+            </w:r>
+            <w:r>
+              <w:rPr>
+                <w:color w:val="000000"/>
+              </w:rPr>
+              <w:t>-</w:t>
+            </w:r>
+            <w:r>
+              <w:rPr>
+                <w:color w:val="000000"/>
+              </w:rPr>
+              <w:t xml:space="preserve"> Funcional, con ingesta real activa (YouTube)</w:t>
             </w:r>
           </w:p>
         </w:tc>
       </w:tr>
       <w:tr>
-        <w:tblPrEx>
-          <w:tblCellMar>
-            <w:top w:w="0" w:type="dxa"/>
-            <w:bottom w:w="0" w:type="dxa"/>
-          </w:tblCellMar>
-        </w:tblPrEx>
         <w:tc>
           <w:tcPr>
             <w:tcW w:w="2266" w:type="dxa"/>
@@ -2102,12 +1740,6 @@
         </w:tc>
       </w:tr>
       <w:tr>
-        <w:tblPrEx>
-          <w:tblCellMar>
-            <w:top w:w="0" w:type="dxa"/>
-            <w:bottom w:w="0" w:type="dxa"/>
-          </w:tblCellMar>
-        </w:tblPrEx>
         <w:tc>
           <w:tcPr>
             <w:tcW w:w="2266" w:type="dxa"/>
@@ -2158,49 +1790,7 @@
               <w:rPr>
                 <w:color w:val="000000"/>
               </w:rPr>
-              <w:t>github.com/</w:t>
-            </w:r>
-            <w:proofErr w:type="spellStart"/>
-            <w:r>
-              <w:rPr>
-                <w:color w:val="000000"/>
-              </w:rPr>
-              <w:t>ricardofel</w:t>
-            </w:r>
-            <w:proofErr w:type="spellEnd"/>
-            <w:r>
-              <w:rPr>
-                <w:color w:val="000000"/>
-              </w:rPr>
-              <w:t>/</w:t>
-            </w:r>
-            <w:proofErr w:type="spellStart"/>
-            <w:r>
-              <w:rPr>
-                <w:color w:val="000000"/>
-              </w:rPr>
-              <w:t>gestion</w:t>
-            </w:r>
-            <w:proofErr w:type="spellEnd"/>
-            <w:r>
-              <w:rPr>
-                <w:color w:val="000000"/>
-              </w:rPr>
-              <w:t>-turismo-</w:t>
-            </w:r>
-            <w:proofErr w:type="spellStart"/>
-            <w:r>
-              <w:rPr>
-                <w:color w:val="000000"/>
-              </w:rPr>
-              <w:t>loja.git</w:t>
-            </w:r>
-            <w:proofErr w:type="spellEnd"/>
-            <w:r>
-              <w:rPr>
-                <w:color w:val="000000"/>
-              </w:rPr>
-              <w:t xml:space="preserve"> (privado — UTPL)</w:t>
+              <w:t>github.com/ricardofel/gestion-turismo-loja.git (privado — UTPL)</w:t>
             </w:r>
           </w:p>
         </w:tc>
@@ -2244,12 +1834,6 @@
         <w:gridCol w:w="5526"/>
       </w:tblGrid>
       <w:tr>
-        <w:tblPrEx>
-          <w:tblCellMar>
-            <w:top w:w="0" w:type="dxa"/>
-            <w:bottom w:w="0" w:type="dxa"/>
-          </w:tblCellMar>
-        </w:tblPrEx>
         <w:tc>
           <w:tcPr>
             <w:tcW w:w="1500" w:type="dxa"/>
@@ -2336,12 +1920,6 @@
         </w:tc>
       </w:tr>
       <w:tr>
-        <w:tblPrEx>
-          <w:tblCellMar>
-            <w:top w:w="0" w:type="dxa"/>
-            <w:bottom w:w="0" w:type="dxa"/>
-          </w:tblCellMar>
-        </w:tblPrEx>
         <w:tc>
           <w:tcPr>
             <w:tcW w:w="1500" w:type="dxa"/>
@@ -2382,7 +1960,10 @@
           </w:tcPr>
           <w:p>
             <w:r>
-              <w:t>Junio 2026</w:t>
+              <w:t>Mayo</w:t>
+            </w:r>
+            <w:r>
+              <w:t xml:space="preserve"> 2026</w:t>
             </w:r>
           </w:p>
         </w:tc>
@@ -2405,6 +1986,83 @@
           <w:p>
             <w:r>
               <w:t>Versión inicial. Pipeline ETL completo con 7 fuentes, panel de administración, CRUD de catálogos, detección automática de lugares y ediciones, arquitectura modular de conectores.</w:t>
+            </w:r>
+          </w:p>
+        </w:tc>
+      </w:tr>
+      <w:tr>
+        <w:tc>
+          <w:tcPr>
+            <w:tcW w:w="1500" w:type="dxa"/>
+            <w:tcBorders>
+              <w:top w:val="single" w:sz="1" w:space="0" w:color="AAAAAA"/>
+              <w:left w:val="single" w:sz="1" w:space="0" w:color="AAAAAA"/>
+              <w:bottom w:val="single" w:sz="1" w:space="0" w:color="AAAAAA"/>
+              <w:right w:val="single" w:sz="1" w:space="0" w:color="AAAAAA"/>
+            </w:tcBorders>
+            <w:tcMar>
+              <w:top w:w="80" w:type="dxa"/>
+              <w:left w:w="120" w:type="dxa"/>
+              <w:bottom w:w="80" w:type="dxa"/>
+              <w:right w:w="120" w:type="dxa"/>
+            </w:tcMar>
+          </w:tcPr>
+          <w:p>
+            <w:r>
+              <w:t>2</w:t>
+            </w:r>
+            <w:r>
+              <w:t>.</w:t>
+            </w:r>
+            <w:r>
+              <w:t>0</w:t>
+            </w:r>
+            <w:r>
+              <w:t>.0</w:t>
+            </w:r>
+          </w:p>
+        </w:tc>
+        <w:tc>
+          <w:tcPr>
+            <w:tcW w:w="2000" w:type="dxa"/>
+            <w:tcBorders>
+              <w:top w:val="single" w:sz="1" w:space="0" w:color="AAAAAA"/>
+              <w:left w:val="single" w:sz="1" w:space="0" w:color="AAAAAA"/>
+              <w:bottom w:val="single" w:sz="1" w:space="0" w:color="AAAAAA"/>
+              <w:right w:val="single" w:sz="1" w:space="0" w:color="AAAAAA"/>
+            </w:tcBorders>
+            <w:tcMar>
+              <w:top w:w="80" w:type="dxa"/>
+              <w:left w:w="120" w:type="dxa"/>
+              <w:bottom w:w="80" w:type="dxa"/>
+              <w:right w:w="120" w:type="dxa"/>
+            </w:tcMar>
+          </w:tcPr>
+          <w:p>
+            <w:r>
+              <w:t>Julio 2026</w:t>
+            </w:r>
+          </w:p>
+        </w:tc>
+        <w:tc>
+          <w:tcPr>
+            <w:tcW w:w="5526" w:type="dxa"/>
+            <w:tcBorders>
+              <w:top w:val="single" w:sz="1" w:space="0" w:color="AAAAAA"/>
+              <w:left w:val="single" w:sz="1" w:space="0" w:color="AAAAAA"/>
+              <w:bottom w:val="single" w:sz="1" w:space="0" w:color="AAAAAA"/>
+              <w:right w:val="single" w:sz="1" w:space="0" w:color="AAAAAA"/>
+            </w:tcBorders>
+            <w:tcMar>
+              <w:top w:w="80" w:type="dxa"/>
+              <w:left w:w="120" w:type="dxa"/>
+              <w:bottom w:w="80" w:type="dxa"/>
+              <w:right w:w="120" w:type="dxa"/>
+            </w:tcMar>
+          </w:tcPr>
+          <w:p>
+            <w:r>
+              <w:t>Activación de YouTube Data API v3 como fuente real; creación automática de ediciones por calendario; detección de duplicados en Lugares/Eventos; editor de recursos con cascada Evento→Edición; buscador en Lugares/Eventos; reclasificación de los recursos sembrados (backfill).</w:t>
             </w:r>
           </w:p>
         </w:tc>
@@ -2480,12 +2138,6 @@
       <w:gridCol w:w="5526"/>
     </w:tblGrid>
     <w:tr>
-      <w:tblPrEx>
-        <w:tblCellMar>
-          <w:top w:w="0" w:type="dxa"/>
-          <w:bottom w:w="0" w:type="dxa"/>
-        </w:tblCellMar>
-      </w:tblPrEx>
       <w:tc>
         <w:tcPr>
           <w:tcW w:w="3500" w:type="dxa"/>

</xml_diff>